<commit_message>
ya tengo todo, falta la cámara
</commit_message>
<xml_diff>
--- a/TORRES CABREJOS_PROY.docx
+++ b/TORRES CABREJOS_PROY.docx
@@ -181,6 +181,8 @@
         </w:rPr>
         <w:t xml:space="preserve">Sistema embebido multimodal para la </w:t>
       </w:r>
+      <w:proofErr w:type="spellStart"/>
+      <w:proofErr w:type="gramStart"/>
       <w:r>
         <w:rPr>
           <w:b/>
@@ -191,7 +193,15 @@
         <w:rPr>
           <w:b/>
         </w:rPr>
-        <w:t>detección de somnolencia y fatiga mental para prevenir negligencias médicas en un consultorio de Chiclayo</w:t>
+        <w:t>detección</w:t>
+      </w:r>
+      <w:proofErr w:type="spellEnd"/>
+      <w:proofErr w:type="gramEnd"/>
+      <w:r>
+        <w:rPr>
+          <w:b/>
+        </w:rPr>
+        <w:t xml:space="preserve"> de somnolencia y fatiga mental para prevenir negligencias médicas en un consultorio de Chiclayo</w:t>
       </w:r>
     </w:p>
     <w:p>
@@ -419,6 +429,8 @@
         <w:lastRenderedPageBreak/>
         <w:t xml:space="preserve">Sistema embebido multimodal para la </w:t>
       </w:r>
+      <w:proofErr w:type="spellStart"/>
+      <w:proofErr w:type="gramStart"/>
       <w:r>
         <w:rPr>
           <w:b/>
@@ -429,7 +441,15 @@
         <w:rPr>
           <w:b/>
         </w:rPr>
-        <w:t>detección de somnolencia y fatiga mental para prevenir negligencias médicas en un consultorio de Chiclayo</w:t>
+        <w:t>detección</w:t>
+      </w:r>
+      <w:proofErr w:type="spellEnd"/>
+      <w:proofErr w:type="gramEnd"/>
+      <w:r>
+        <w:rPr>
+          <w:b/>
+        </w:rPr>
+        <w:t xml:space="preserve"> de somnolencia y fatiga mental para prevenir negligencias médicas en un consultorio de Chiclayo</w:t>
       </w:r>
     </w:p>
     <w:p>
@@ -764,7 +784,15 @@
         <w:jc w:val="both"/>
       </w:pPr>
       <w:r>
-        <w:t xml:space="preserve">La causa raíz de esta problemática en el contexto peruano es un sistema de salud sobrecargado que ha normalizado el pluriempleo. La escasez de especialistas y las bajas remuneraciones han llevado al Estado a legalizar el doble empleo médico mediante la Ley N° 32145 (2024) </w:t>
+        <w:t xml:space="preserve">La causa raíz de esta problemática en el contexto peruano es un sistema de salud sobrecargado que ha normalizado el pluriempleo. La escasez de especialistas y las bajas remuneraciones han llevado al Estado a legalizar el doble empleo médico mediante la Ley </w:t>
+      </w:r>
+      <w:proofErr w:type="spellStart"/>
+      <w:r>
+        <w:t>N°</w:t>
+      </w:r>
+      <w:proofErr w:type="spellEnd"/>
+      <w:r>
+        <w:t xml:space="preserve"> 32145 (2024) </w:t>
       </w:r>
       <w:r>
         <w:fldChar w:fldCharType="begin"/>
@@ -828,7 +856,15 @@
         <w:jc w:val="both"/>
       </w:pPr>
       <w:r>
-        <w:t xml:space="preserve">De no implementarse mecanismos de monitoreo, la persistencia de la fatiga se traducirá en mayores latencias de respuesta y en la omisión de pasos críticos en los protocolos de cirugía segura (R.M. Nº 1021-2010-MINSA) </w:t>
+        <w:t xml:space="preserve">De no implementarse mecanismos de monitoreo, la persistencia de la fatiga se traducirá en mayores latencias de respuesta y en la omisión de pasos críticos en los protocolos de cirugía segura (R.M. </w:t>
+      </w:r>
+      <w:proofErr w:type="spellStart"/>
+      <w:r>
+        <w:t>Nº</w:t>
+      </w:r>
+      <w:proofErr w:type="spellEnd"/>
+      <w:r>
+        <w:t xml:space="preserve"> 1021-2010-MINSA) </w:t>
       </w:r>
       <w:r>
         <w:fldChar w:fldCharType="begin"/>
@@ -928,7 +964,23 @@
         <w:fldChar w:fldCharType="end"/>
       </w:r>
       <w:r>
-        <w:t xml:space="preserve">, hasta sistemas IoT basados en Python/OpenCV y redes LSTM </w:t>
+        <w:t xml:space="preserve">, hasta sistemas </w:t>
+      </w:r>
+      <w:proofErr w:type="spellStart"/>
+      <w:r>
+        <w:t>IoT</w:t>
+      </w:r>
+      <w:proofErr w:type="spellEnd"/>
+      <w:r>
+        <w:t xml:space="preserve"> basados en Python/</w:t>
+      </w:r>
+      <w:proofErr w:type="spellStart"/>
+      <w:r>
+        <w:t>OpenCV</w:t>
+      </w:r>
+      <w:proofErr w:type="spellEnd"/>
+      <w:r>
+        <w:t xml:space="preserve"> y redes LSTM </w:t>
       </w:r>
       <w:r>
         <w:fldChar w:fldCharType="begin"/>
@@ -946,7 +998,31 @@
         <w:fldChar w:fldCharType="end"/>
       </w:r>
       <w:r>
-        <w:t>. No obstante, el alto costo del hardware especializado suele limitar su replicabilidad en el sector público. Ante esto, se propone una solución multimodal que utiliza una laptop como unidad de procesamiento local, integrando su cámara para análisis conductual y fotopletismografía remota (rPPG), vinculada a un microcontrolador Arduino UNO con sensores sEMG para monitoreo fisiológico. Esta configuración representa una alternativa accesible, modular y de bajo costo para evaluar la alerta cognitiva del profesional antes de iniciar un procedimiento.</w:t>
+        <w:t xml:space="preserve">. No obstante, el alto costo del hardware especializado suele limitar su replicabilidad en el sector público. Ante esto, se propone una solución multimodal que utiliza una laptop como unidad de procesamiento local, integrando su cámara para análisis conductual y </w:t>
+      </w:r>
+      <w:proofErr w:type="spellStart"/>
+      <w:r>
+        <w:t>fotopletismografía</w:t>
+      </w:r>
+      <w:proofErr w:type="spellEnd"/>
+      <w:r>
+        <w:t xml:space="preserve"> remota (</w:t>
+      </w:r>
+      <w:proofErr w:type="spellStart"/>
+      <w:r>
+        <w:t>rPPG</w:t>
+      </w:r>
+      <w:proofErr w:type="spellEnd"/>
+      <w:r>
+        <w:t xml:space="preserve">), vinculada a un microcontrolador Arduino UNO con sensores </w:t>
+      </w:r>
+      <w:proofErr w:type="spellStart"/>
+      <w:r>
+        <w:t>sEMG</w:t>
+      </w:r>
+      <w:proofErr w:type="spellEnd"/>
+      <w:r>
+        <w:t xml:space="preserve"> para monitoreo fisiológico. Esta configuración representa una alternativa accesible, modular y de bajo costo para evaluar la alerta cognitiva del profesional antes de iniciar un procedimiento.</w:t>
       </w:r>
     </w:p>
     <w:p>
@@ -954,9 +1030,6 @@
         <w:spacing w:line="360" w:lineRule="auto"/>
         <w:ind w:left="709" w:firstLine="284"/>
         <w:jc w:val="both"/>
-        <w:rPr>
-          <w:lang w:val="es-PE"/>
-        </w:rPr>
       </w:pPr>
       <w:r>
         <w:t xml:space="preserve">El consultorio oftalmológico </w:t>
@@ -973,7 +1046,83 @@
       </w:r>
       <w:r>
         <w:lastRenderedPageBreak/>
-        <w:t>pluriempleo y riesgo clínico. La mayoría de su personal médico experimenta signos y síntomas de burnout (ver Anexo 02) debido a la acumulación de horas entre la práctica pública y privada, en una región con un déficit crítico de oftalmólogos. En un entorno donde los márgenes de error son mínimos y se demanda una precisión visual extrema, la implementación de esta herramienta tecnológica permitirá intervenir preventivamente sobre la fatiga mental del profesional. Esto asegura el cumplimiento de los lineamientos de seguridad de la institución y promueve una cultura de prevención de negligencias médicas alineada con los estándares del MINSA.</w:t>
+        <w:t>pluriempleo y riesgo clínico. La mayoría de su</w:t>
+      </w:r>
+      <w:r>
+        <w:t xml:space="preserve"> </w:t>
+      </w:r>
+      <w:r>
+        <w:t>personal médico experimenta signos y síntomas de burnout (ver Anexo 02) debido a la acumulación de horas entre la práctica pública y privada, fenómeno agudizado por el déficit crítico de oftalmólogos</w:t>
+      </w:r>
+      <w:r>
+        <w:t xml:space="preserve"> </w:t>
+      </w:r>
+      <w:r>
+        <w:t>en la región Lambayeque, donde la escasa oferta de especialistas obliga a quienes ejercen a cubrir jornadas extendidas y consultas consecutivas sin descansos efectivos. A esta sobrecarga se suma la</w:t>
+      </w:r>
+      <w:r>
+        <w:t xml:space="preserve"> </w:t>
+      </w:r>
+      <w:r>
+        <w:t>ausencia de instrumentos institucionales de tamizaje</w:t>
+      </w:r>
+      <w:r>
+        <w:t xml:space="preserve">, </w:t>
+      </w:r>
+      <w:r>
+        <w:t xml:space="preserve">no se aplican test validados de somnolencia ni autoevaluaciones de fatiga como </w:t>
+      </w:r>
+      <w:proofErr w:type="spellStart"/>
+      <w:r>
+        <w:t>Epworth</w:t>
+      </w:r>
+      <w:proofErr w:type="spellEnd"/>
+      <w:r>
+        <w:t xml:space="preserve">, Karolinska o el Stanford </w:t>
+      </w:r>
+      <w:proofErr w:type="spellStart"/>
+      <w:r>
+        <w:t>Sleepiness</w:t>
+      </w:r>
+      <w:proofErr w:type="spellEnd"/>
+      <w:r>
+        <w:t xml:space="preserve"> Scale, de modo que el</w:t>
+      </w:r>
+      <w:r>
+        <w:t xml:space="preserve"> </w:t>
+      </w:r>
+      <w:r>
+        <w:t>agotamiento del profesional permanece invisible hasta que se manifiesta como un error clínico. Tampoco existen herramientas digitales que automaticen esta vigilancia: la detección depende</w:t>
+      </w:r>
+      <w:r>
+        <w:t xml:space="preserve"> </w:t>
+      </w:r>
+      <w:r>
+        <w:t>exclusivamente del juicio subjetivo del propio médico, quien, paradójicamente, es el menos capaz de reconocer su propio deterioro cognitivo cuando este ya está instalado. En un entorno donde los</w:t>
+      </w:r>
+      <w:r>
+        <w:t xml:space="preserve"> </w:t>
+      </w:r>
+      <w:r>
+        <w:t>márgenes de error son mínimos y se demanda una precisión visual extrema</w:t>
+      </w:r>
+      <w:r>
+        <w:t xml:space="preserve">, </w:t>
+      </w:r>
+      <w:r>
+        <w:t>la</w:t>
+      </w:r>
+      <w:r>
+        <w:t xml:space="preserve"> </w:t>
+      </w:r>
+      <w:r>
+        <w:t>implementación de esta herramienta tecnológica permitirá intervenir preventivamente sobre la fatiga mental del profesional mediante alertas objetivas y trazables. Esto asegura el cumplimiento de los</w:t>
+      </w:r>
+      <w:r>
+        <w:t xml:space="preserve"> </w:t>
+      </w:r>
+      <w:r>
+        <w:t>lineamientos de seguridad de la institución y promueve una cultura de prevención de negligencias médicas alineada con los estándares del MINSA.</w:t>
       </w:r>
     </w:p>
     <w:p>
@@ -981,9 +1130,6 @@
         <w:spacing w:line="360" w:lineRule="auto"/>
         <w:ind w:left="709" w:firstLine="284"/>
         <w:jc w:val="both"/>
-        <w:rPr>
-          <w:lang w:val="es-PE"/>
-        </w:rPr>
       </w:pPr>
       <w:r>
         <w:rPr>
@@ -1015,6 +1161,8 @@
         </w:rPr>
         <w:t xml:space="preserve"> para la </w:t>
       </w:r>
+      <w:proofErr w:type="spellStart"/>
+      <w:proofErr w:type="gramStart"/>
       <w:r>
         <w:rPr>
           <w:lang w:val="es-PE"/>
@@ -1027,6 +1175,8 @@
         </w:rPr>
         <w:t>detección</w:t>
       </w:r>
+      <w:proofErr w:type="spellEnd"/>
+      <w:proofErr w:type="gramEnd"/>
       <w:r>
         <w:rPr>
           <w:lang w:val="es-PE"/>
@@ -1421,7 +1571,15 @@
         <w:t>s</w:t>
       </w:r>
       <w:r>
-        <w:t xml:space="preserve">oftware basado en IoT para la detección temprana de somnolencia y fatiga mental en cirujanos </w:t>
+        <w:t xml:space="preserve">oftware basado en </w:t>
+      </w:r>
+      <w:proofErr w:type="spellStart"/>
+      <w:r>
+        <w:t>IoT</w:t>
+      </w:r>
+      <w:proofErr w:type="spellEnd"/>
+      <w:r>
+        <w:t xml:space="preserve"> para la detección temprana de somnolencia y fatiga mental en cirujanos </w:t>
       </w:r>
       <w:r>
         <w:t>para prevenir</w:t>
@@ -1630,11 +1788,16 @@
         <w:contextualSpacing w:val="0"/>
       </w:pPr>
       <w:r>
-        <w:t>Evaluar el sistema integrado a través de prueba</w:t>
+        <w:t xml:space="preserve">Evaluar el sistema integrado a través de </w:t>
+      </w:r>
+      <w:proofErr w:type="spellStart"/>
+      <w:r>
+        <w:t>prueba</w:t>
       </w:r>
       <w:r>
         <w:t>ls</w:t>
       </w:r>
+      <w:proofErr w:type="spellEnd"/>
       <w:r>
         <w:t xml:space="preserve">, </w:t>
       </w:r>
@@ -1878,7 +2041,21 @@
         <w:rPr>
           <w:lang w:val="es-PE"/>
         </w:rPr>
-        <w:t xml:space="preserve">, diseñaron un algoritmo de alerta anti-sueño en tiempo real basado en modelos de redes convolucionales profundas (InceptionV3, VGG16 y MobileNetV2), </w:t>
+        <w:t xml:space="preserve">, diseñaron un algoritmo de alerta </w:t>
+      </w:r>
+      <w:proofErr w:type="spellStart"/>
+      <w:r>
+        <w:rPr>
+          <w:lang w:val="es-PE"/>
+        </w:rPr>
+        <w:t>anti-sueño</w:t>
+      </w:r>
+      <w:proofErr w:type="spellEnd"/>
+      <w:r>
+        <w:rPr>
+          <w:lang w:val="es-PE"/>
+        </w:rPr>
+        <w:t xml:space="preserve"> en tiempo real basado en modelos de redes convolucionales profundas (InceptionV3, VGG16 y MobileNetV2), </w:t>
       </w:r>
       <w:r>
         <w:rPr>
@@ -2059,7 +2236,21 @@
         <w:rPr>
           <w:lang w:val="es-PE"/>
         </w:rPr>
-        <w:t>de redes neuronales convolucioneales (CNN)</w:t>
+        <w:t xml:space="preserve">de redes neuronales </w:t>
+      </w:r>
+      <w:proofErr w:type="spellStart"/>
+      <w:r>
+        <w:rPr>
+          <w:lang w:val="es-PE"/>
+        </w:rPr>
+        <w:t>convolucioneales</w:t>
+      </w:r>
+      <w:proofErr w:type="spellEnd"/>
+      <w:r>
+        <w:rPr>
+          <w:lang w:val="es-PE"/>
+        </w:rPr>
+        <w:t xml:space="preserve"> (CNN)</w:t>
       </w:r>
       <w:r>
         <w:rPr>
@@ -2198,7 +2389,21 @@
         <w:rPr>
           <w:lang w:val="es-PE"/>
         </w:rPr>
-        <w:t xml:space="preserve"> que combina un Swin Transformer para la extracción de características con un modelo de difusión U-Net para la eliminación de ruido. Este sistema obtuvo una precisión de hasta 99,82%, lo que confirmó su escalabilidad y resistencia frente a escenarios desafiantes </w:t>
+        <w:t xml:space="preserve"> que combina un Swin </w:t>
+      </w:r>
+      <w:proofErr w:type="spellStart"/>
+      <w:r>
+        <w:rPr>
+          <w:lang w:val="es-PE"/>
+        </w:rPr>
+        <w:t>Transformer</w:t>
+      </w:r>
+      <w:proofErr w:type="spellEnd"/>
+      <w:r>
+        <w:rPr>
+          <w:lang w:val="es-PE"/>
+        </w:rPr>
+        <w:t xml:space="preserve"> para la extracción de características con un modelo de difusión U-Net para la eliminación de ruido. Este sistema obtuvo una precisión de hasta 99,82%, lo que confirmó su escalabilidad y resistencia frente a escenarios desafiantes </w:t>
       </w:r>
       <w:r>
         <w:rPr>
@@ -2338,7 +2543,35 @@
         <w:rPr>
           <w:lang w:val="es-PE"/>
         </w:rPr>
-        <w:t xml:space="preserve"> arquitecturas ligeras como VGG16 y MobileNet ofrecen un mejor equilibrio entre exactitud (≈97%) y velocidad en dispositivos embebidos, mientras que los ViT alcanzaron métricas superiores (F1=0,99) en entornos con GPU </w:t>
+        <w:t xml:space="preserve"> arquitecturas ligeras como VGG16 y </w:t>
+      </w:r>
+      <w:proofErr w:type="spellStart"/>
+      <w:r>
+        <w:rPr>
+          <w:lang w:val="es-PE"/>
+        </w:rPr>
+        <w:t>MobileNet</w:t>
+      </w:r>
+      <w:proofErr w:type="spellEnd"/>
+      <w:r>
+        <w:rPr>
+          <w:lang w:val="es-PE"/>
+        </w:rPr>
+        <w:t xml:space="preserve"> ofrecen un mejor equilibrio entre exactitud (≈97%) y velocidad en dispositivos embebidos, mientras que los </w:t>
+      </w:r>
+      <w:proofErr w:type="spellStart"/>
+      <w:r>
+        <w:rPr>
+          <w:lang w:val="es-PE"/>
+        </w:rPr>
+        <w:t>ViT</w:t>
+      </w:r>
+      <w:proofErr w:type="spellEnd"/>
+      <w:r>
+        <w:rPr>
+          <w:lang w:val="es-PE"/>
+        </w:rPr>
+        <w:t xml:space="preserve"> alcanzaron métricas superiores (F1=0,99) en entornos con GPU </w:t>
       </w:r>
       <w:r>
         <w:rPr>
@@ -2393,7 +2626,21 @@
         <w:rPr>
           <w:lang w:val="es-PE"/>
         </w:rPr>
-        <w:t xml:space="preserve">Noaman Al-hayanni et al. </w:t>
+        <w:t>Noaman Al-</w:t>
+      </w:r>
+      <w:proofErr w:type="spellStart"/>
+      <w:r>
+        <w:rPr>
+          <w:lang w:val="es-PE"/>
+        </w:rPr>
+        <w:t>hayanni</w:t>
+      </w:r>
+      <w:proofErr w:type="spellEnd"/>
+      <w:r>
+        <w:rPr>
+          <w:lang w:val="es-PE"/>
+        </w:rPr>
+        <w:t xml:space="preserve"> et al. </w:t>
       </w:r>
       <w:r>
         <w:rPr>
@@ -2417,19 +2664,69 @@
         <w:rPr>
           <w:lang w:val="es-PE"/>
         </w:rPr>
-        <w:t>la somnolencia. Para ello, desarrollaron un sistema inteligente de auto-detención</w:t>
-      </w:r>
-      <w:r>
-        <w:rPr>
-          <w:lang w:val="es-PE"/>
-        </w:rPr>
-        <w:t xml:space="preserve"> (autoparking)</w:t>
-      </w:r>
-      <w:r>
-        <w:rPr>
-          <w:lang w:val="es-PE"/>
-        </w:rPr>
-        <w:t xml:space="preserve"> en tiempo real soportado en modelos de deep learning que integran reconocimiento facial y detección de somnolencia. Los experimentos mostraron una precisión cercana al 99,1% y la activación automática de respuestas de seguridad, lo que evidenció la pertinencia de este tipo de soluciones en contextos donde los errores humanos tienen consecuencias críticas </w:t>
+        <w:t xml:space="preserve">la somnolencia. Para ello, desarrollaron un sistema inteligente de </w:t>
+      </w:r>
+      <w:proofErr w:type="spellStart"/>
+      <w:r>
+        <w:rPr>
+          <w:lang w:val="es-PE"/>
+        </w:rPr>
+        <w:t>auto-detención</w:t>
+      </w:r>
+      <w:proofErr w:type="spellEnd"/>
+      <w:r>
+        <w:rPr>
+          <w:lang w:val="es-PE"/>
+        </w:rPr>
+        <w:t xml:space="preserve"> (</w:t>
+      </w:r>
+      <w:proofErr w:type="spellStart"/>
+      <w:r>
+        <w:rPr>
+          <w:lang w:val="es-PE"/>
+        </w:rPr>
+        <w:t>autoparking</w:t>
+      </w:r>
+      <w:proofErr w:type="spellEnd"/>
+      <w:r>
+        <w:rPr>
+          <w:lang w:val="es-PE"/>
+        </w:rPr>
+        <w:t>)</w:t>
+      </w:r>
+      <w:r>
+        <w:rPr>
+          <w:lang w:val="es-PE"/>
+        </w:rPr>
+        <w:t xml:space="preserve"> en tiempo real soportado en modelos de </w:t>
+      </w:r>
+      <w:proofErr w:type="spellStart"/>
+      <w:r>
+        <w:rPr>
+          <w:lang w:val="es-PE"/>
+        </w:rPr>
+        <w:t>deep</w:t>
+      </w:r>
+      <w:proofErr w:type="spellEnd"/>
+      <w:r>
+        <w:rPr>
+          <w:lang w:val="es-PE"/>
+        </w:rPr>
+        <w:t xml:space="preserve"> </w:t>
+      </w:r>
+      <w:proofErr w:type="spellStart"/>
+      <w:r>
+        <w:rPr>
+          <w:lang w:val="es-PE"/>
+        </w:rPr>
+        <w:t>learning</w:t>
+      </w:r>
+      <w:proofErr w:type="spellEnd"/>
+      <w:r>
+        <w:rPr>
+          <w:lang w:val="es-PE"/>
+        </w:rPr>
+        <w:t xml:space="preserve"> que integran reconocimiento facial y detección de somnolencia. Los experimentos mostraron una precisión cercana al 99,1% y la activación automática de respuestas de seguridad, lo que evidenció la pertinencia de este tipo de soluciones en contextos donde los errores humanos tienen consecuencias críticas </w:t>
       </w:r>
       <w:r>
         <w:rPr>
@@ -2564,7 +2861,21 @@
         <w:rPr>
           <w:lang w:val="es-PE"/>
         </w:rPr>
-        <w:t xml:space="preserve"> en tareas de alta concentración, como la conducción o la cirugía. La World Health Organization destaca que los errores derivados del cansancio son una de las principales amenazas para la seguridad del paciente en contextos hospitalarios</w:t>
+        <w:t xml:space="preserve"> en tareas de alta concentración, como la conducción o la cirugía. La World Health </w:t>
+      </w:r>
+      <w:proofErr w:type="spellStart"/>
+      <w:r>
+        <w:rPr>
+          <w:lang w:val="es-PE"/>
+        </w:rPr>
+        <w:t>Organization</w:t>
+      </w:r>
+      <w:proofErr w:type="spellEnd"/>
+      <w:r>
+        <w:rPr>
+          <w:lang w:val="es-PE"/>
+        </w:rPr>
+        <w:t xml:space="preserve"> destaca que los errores derivados del cansancio son una de las principales amenazas para la seguridad del paciente en contextos hospitalarios</w:t>
       </w:r>
       <w:r>
         <w:rPr>
@@ -2749,7 +3060,49 @@
         <w:rPr>
           <w:lang w:val="es-PE"/>
         </w:rPr>
-        <w:t>. Pathak et al. desarrollaron un algoritmo de alerta anti-sueño basado en deep learning, empleando arquitecturas como InceptionV3 y MobileNetV2 sobre plataformas de bajo costo, alcanzando una precisión de hasta 99.18% en la</w:t>
+        <w:t xml:space="preserve">. Pathak et al. desarrollaron un algoritmo de alerta </w:t>
+      </w:r>
+      <w:proofErr w:type="spellStart"/>
+      <w:r>
+        <w:rPr>
+          <w:lang w:val="es-PE"/>
+        </w:rPr>
+        <w:t>anti-sueño</w:t>
+      </w:r>
+      <w:proofErr w:type="spellEnd"/>
+      <w:r>
+        <w:rPr>
+          <w:lang w:val="es-PE"/>
+        </w:rPr>
+        <w:t xml:space="preserve"> basado en </w:t>
+      </w:r>
+      <w:proofErr w:type="spellStart"/>
+      <w:r>
+        <w:rPr>
+          <w:lang w:val="es-PE"/>
+        </w:rPr>
+        <w:t>deep</w:t>
+      </w:r>
+      <w:proofErr w:type="spellEnd"/>
+      <w:r>
+        <w:rPr>
+          <w:lang w:val="es-PE"/>
+        </w:rPr>
+        <w:t xml:space="preserve"> </w:t>
+      </w:r>
+      <w:proofErr w:type="spellStart"/>
+      <w:r>
+        <w:rPr>
+          <w:lang w:val="es-PE"/>
+        </w:rPr>
+        <w:t>learning</w:t>
+      </w:r>
+      <w:proofErr w:type="spellEnd"/>
+      <w:r>
+        <w:rPr>
+          <w:lang w:val="es-PE"/>
+        </w:rPr>
+        <w:t>, empleando arquitecturas como InceptionV3 y MobileNetV2 sobre plataformas de bajo costo, alcanzando una precisión de hasta 99.18% en la</w:t>
       </w:r>
       <w:r>
         <w:rPr>
@@ -2817,7 +3170,35 @@
         <w:rPr>
           <w:lang w:val="es-PE"/>
         </w:rPr>
-        <w:t xml:space="preserve">Noaman Al-Hayanni et al. propusieron un sistema de detención automática de vehículos mediante modelos de aprendizaje profundo, demostrando que la integración entre visión por computadora e Internet de las Cosas (IoT) permite respuestas inmediatas ante señales de fatiga </w:t>
+        <w:t>Noaman Al-</w:t>
+      </w:r>
+      <w:proofErr w:type="spellStart"/>
+      <w:r>
+        <w:rPr>
+          <w:lang w:val="es-PE"/>
+        </w:rPr>
+        <w:t>Hayanni</w:t>
+      </w:r>
+      <w:proofErr w:type="spellEnd"/>
+      <w:r>
+        <w:rPr>
+          <w:lang w:val="es-PE"/>
+        </w:rPr>
+        <w:t xml:space="preserve"> et al. propusieron un sistema de detención automática de vehículos mediante modelos de aprendizaje profundo, demostrando que la integración entre visión por computadora e Internet de las Cosas (</w:t>
+      </w:r>
+      <w:proofErr w:type="spellStart"/>
+      <w:r>
+        <w:rPr>
+          <w:lang w:val="es-PE"/>
+        </w:rPr>
+        <w:t>IoT</w:t>
+      </w:r>
+      <w:proofErr w:type="spellEnd"/>
+      <w:r>
+        <w:rPr>
+          <w:lang w:val="es-PE"/>
+        </w:rPr>
+        <w:t xml:space="preserve">) permite respuestas inmediatas ante señales de fatiga </w:t>
       </w:r>
       <w:r>
         <w:rPr>
@@ -2924,7 +3305,35 @@
         <w:rPr>
           <w:lang w:val="es-PE"/>
         </w:rPr>
-        <w:t xml:space="preserve"> signos de fatiga ocular, utilizando edge computing para </w:t>
+        <w:t xml:space="preserve"> signos de fatiga ocular, utilizando </w:t>
+      </w:r>
+      <w:proofErr w:type="spellStart"/>
+      <w:r>
+        <w:rPr>
+          <w:lang w:val="es-PE"/>
+        </w:rPr>
+        <w:t>edge</w:t>
+      </w:r>
+      <w:proofErr w:type="spellEnd"/>
+      <w:r>
+        <w:rPr>
+          <w:lang w:val="es-PE"/>
+        </w:rPr>
+        <w:t xml:space="preserve"> </w:t>
+      </w:r>
+      <w:proofErr w:type="spellStart"/>
+      <w:r>
+        <w:rPr>
+          <w:lang w:val="es-PE"/>
+        </w:rPr>
+        <w:t>computing</w:t>
+      </w:r>
+      <w:proofErr w:type="spellEnd"/>
+      <w:r>
+        <w:rPr>
+          <w:lang w:val="es-PE"/>
+        </w:rPr>
+        <w:t xml:space="preserve"> para </w:t>
       </w:r>
       <w:r>
         <w:rPr>
@@ -3024,7 +3433,35 @@
         <w:rPr>
           <w:lang w:val="es-PE"/>
         </w:rPr>
-        <w:t xml:space="preserve"> reforzaron la eficacia de los modelos convolucionales frente a técnicas tradicionales como Support Vector Machines o K-Nearest Neighbors, debido a su capacidad para extraer automáticamente características complejas de imágene</w:t>
+        <w:t xml:space="preserve"> reforzaron la eficacia de los modelos convolucionales frente a técnicas tradicionales como </w:t>
+      </w:r>
+      <w:proofErr w:type="spellStart"/>
+      <w:r>
+        <w:rPr>
+          <w:lang w:val="es-PE"/>
+        </w:rPr>
+        <w:t>Support</w:t>
+      </w:r>
+      <w:proofErr w:type="spellEnd"/>
+      <w:r>
+        <w:rPr>
+          <w:lang w:val="es-PE"/>
+        </w:rPr>
+        <w:t xml:space="preserve"> Vector Machines o K-</w:t>
+      </w:r>
+      <w:proofErr w:type="spellStart"/>
+      <w:r>
+        <w:rPr>
+          <w:lang w:val="es-PE"/>
+        </w:rPr>
+        <w:t>Nearest</w:t>
+      </w:r>
+      <w:proofErr w:type="spellEnd"/>
+      <w:r>
+        <w:rPr>
+          <w:lang w:val="es-PE"/>
+        </w:rPr>
+        <w:t xml:space="preserve"> Neighbors, debido a su capacidad para extraer automáticamente características complejas de imágene</w:t>
       </w:r>
       <w:r>
         <w:rPr>
@@ -3148,7 +3585,77 @@
           <w:lang w:val="es-PE"/>
         </w:rPr>
         <w:lastRenderedPageBreak/>
-        <w:t>Asimismo, el modelo integra técnicas de entrenamiento adversarial (Fast Gradient Sign Method y Projected Gradient Descent), que fortalecen la resistencia del sistema frente a perturbaciones visuales, lo cual garantiza la estabilidad del monitoreo incluso bajo variaciones súbitas de iluminación propias del entorno hospitalario.</w:t>
+        <w:t xml:space="preserve">Asimismo, el modelo integra técnicas de entrenamiento adversarial (Fast </w:t>
+      </w:r>
+      <w:proofErr w:type="spellStart"/>
+      <w:r>
+        <w:rPr>
+          <w:lang w:val="es-PE"/>
+        </w:rPr>
+        <w:t>Gradient</w:t>
+      </w:r>
+      <w:proofErr w:type="spellEnd"/>
+      <w:r>
+        <w:rPr>
+          <w:lang w:val="es-PE"/>
+        </w:rPr>
+        <w:t xml:space="preserve"> </w:t>
+      </w:r>
+      <w:proofErr w:type="spellStart"/>
+      <w:r>
+        <w:rPr>
+          <w:lang w:val="es-PE"/>
+        </w:rPr>
+        <w:t>Sign</w:t>
+      </w:r>
+      <w:proofErr w:type="spellEnd"/>
+      <w:r>
+        <w:rPr>
+          <w:lang w:val="es-PE"/>
+        </w:rPr>
+        <w:t xml:space="preserve"> Method y </w:t>
+      </w:r>
+      <w:proofErr w:type="spellStart"/>
+      <w:r>
+        <w:rPr>
+          <w:lang w:val="es-PE"/>
+        </w:rPr>
+        <w:t>Projected</w:t>
+      </w:r>
+      <w:proofErr w:type="spellEnd"/>
+      <w:r>
+        <w:rPr>
+          <w:lang w:val="es-PE"/>
+        </w:rPr>
+        <w:t xml:space="preserve"> </w:t>
+      </w:r>
+      <w:proofErr w:type="spellStart"/>
+      <w:r>
+        <w:rPr>
+          <w:lang w:val="es-PE"/>
+        </w:rPr>
+        <w:t>Gradient</w:t>
+      </w:r>
+      <w:proofErr w:type="spellEnd"/>
+      <w:r>
+        <w:rPr>
+          <w:lang w:val="es-PE"/>
+        </w:rPr>
+        <w:t xml:space="preserve"> </w:t>
+      </w:r>
+      <w:proofErr w:type="spellStart"/>
+      <w:r>
+        <w:rPr>
+          <w:lang w:val="es-PE"/>
+        </w:rPr>
+        <w:t>Descent</w:t>
+      </w:r>
+      <w:proofErr w:type="spellEnd"/>
+      <w:r>
+        <w:rPr>
+          <w:lang w:val="es-PE"/>
+        </w:rPr>
+        <w:t>), que fortalecen la resistencia del sistema frente a perturbaciones visuales, lo cual garantiza la estabilidad del monitoreo incluso bajo variaciones súbitas de iluminación propias del entorno hospitalario.</w:t>
       </w:r>
     </w:p>
     <w:p>
@@ -3444,27 +3951,51 @@
           <w:lang w:val="es-PE"/>
         </w:rPr>
       </w:pPr>
+      <w:proofErr w:type="spellStart"/>
       <w:r>
         <w:rPr>
           <w:b/>
           <w:bCs/>
           <w:lang w:val="es-PE"/>
         </w:rPr>
-        <w:t>sEMG del trapecio como biomarcador de estrés cognitivo</w:t>
-      </w:r>
+        <w:t>sEMG</w:t>
+      </w:r>
+      <w:proofErr w:type="spellEnd"/>
       <w:r>
         <w:rPr>
           <w:b/>
           <w:bCs/>
           <w:lang w:val="es-PE"/>
         </w:rPr>
+        <w:t xml:space="preserve"> del trapecio como biomarcador de estrés cognitivo</w:t>
+      </w:r>
+      <w:r>
+        <w:rPr>
+          <w:b/>
+          <w:bCs/>
+          <w:lang w:val="es-PE"/>
+        </w:rPr>
         <w:t xml:space="preserve">: </w:t>
       </w:r>
       <w:r>
         <w:rPr>
           <w:lang w:val="es-PE"/>
         </w:rPr>
-        <w:t xml:space="preserve">A diferencia de la electromiografía aplicada tradicionalmente al estudio de la fatiga muscular localizada, el sEMG del trapecio superior ha sido ampliamente validado como indicador fisiológico de estrés cognitivo y fatiga mental. Esta distinción es crucial: la musculatura de la cintura escapular, y en particular el trapecio superior, presenta </w:t>
+        <w:t xml:space="preserve">A diferencia de la electromiografía aplicada tradicionalmente al estudio de la fatiga muscular localizada, el </w:t>
+      </w:r>
+      <w:proofErr w:type="spellStart"/>
+      <w:r>
+        <w:rPr>
+          <w:lang w:val="es-PE"/>
+        </w:rPr>
+        <w:t>sEMG</w:t>
+      </w:r>
+      <w:proofErr w:type="spellEnd"/>
+      <w:r>
+        <w:rPr>
+          <w:lang w:val="es-PE"/>
+        </w:rPr>
+        <w:t xml:space="preserve"> del trapecio superior ha sido ampliamente validado como indicador fisiológico de estrés cognitivo y fatiga mental. Esta distinción es crucial: la musculatura de la cintura escapular, y en particular el trapecio superior, presenta </w:t>
       </w:r>
       <w:r>
         <w:rPr>
@@ -3479,11 +4010,19 @@
         </w:rPr>
         <w:t xml:space="preserve"> </w:t>
       </w:r>
-      <w:r>
-        <w:rPr>
-          <w:lang w:val="es-PE"/>
-        </w:rPr>
-        <w:t xml:space="preserve">Wijsman et al. </w:t>
+      <w:proofErr w:type="spellStart"/>
+      <w:r>
+        <w:rPr>
+          <w:lang w:val="es-PE"/>
+        </w:rPr>
+        <w:t>Wijsman</w:t>
+      </w:r>
+      <w:proofErr w:type="spellEnd"/>
+      <w:r>
+        <w:rPr>
+          <w:lang w:val="es-PE"/>
+        </w:rPr>
+        <w:t xml:space="preserve"> et al. </w:t>
       </w:r>
       <w:r>
         <w:rPr>
@@ -3516,7 +4055,49 @@
         <w:rPr>
           <w:lang w:val="es-PE"/>
         </w:rPr>
-        <w:t xml:space="preserve"> midieron sEMG del trapecio superior en adultos sanos durante tres condiciones de estrés cognitivo (prueba de Norinder, un puzzle lógico y una prueba de memoria). Los resultados mostraron amplitudes EMG significativamente mayores durante estrés (+2,6 % del nivel de contracción de referencia) y un tiempo relativo con "EMG gaps" (períodos de relajación muscular) significativamente menor (-14,3 % del tiempo). Adicionalmente, las frecuencias media y mediana del espectro de potencia disminuyeron -8,6 Hz y -8,8 Hz respectivamente. Estos marcadores se correlacionaron con niveles subjetivos de estrés (r = 0,32 con RMS), confirmando el valor del sEMG como parámetro objetivo para la detección de estados cognitivos alterados.</w:t>
+        <w:t xml:space="preserve"> midieron </w:t>
+      </w:r>
+      <w:proofErr w:type="spellStart"/>
+      <w:r>
+        <w:rPr>
+          <w:lang w:val="es-PE"/>
+        </w:rPr>
+        <w:t>sEMG</w:t>
+      </w:r>
+      <w:proofErr w:type="spellEnd"/>
+      <w:r>
+        <w:rPr>
+          <w:lang w:val="es-PE"/>
+        </w:rPr>
+        <w:t xml:space="preserve"> del trapecio superior en adultos sanos durante tres condiciones de estrés cognitivo (prueba de Norinder, un </w:t>
+      </w:r>
+      <w:proofErr w:type="spellStart"/>
+      <w:r>
+        <w:rPr>
+          <w:lang w:val="es-PE"/>
+        </w:rPr>
+        <w:t>puzzle</w:t>
+      </w:r>
+      <w:proofErr w:type="spellEnd"/>
+      <w:r>
+        <w:rPr>
+          <w:lang w:val="es-PE"/>
+        </w:rPr>
+        <w:t xml:space="preserve"> lógico y una prueba de memoria). Los resultados mostraron amplitudes EMG significativamente mayores durante estrés (+2,6 % del nivel de contracción de referencia) y un tiempo relativo con "EMG gaps" (períodos de relajación muscular) significativamente menor (-14,3 % del tiempo). Adicionalmente, las frecuencias media y mediana del espectro de potencia disminuyeron -8,6 Hz y -8,8 Hz respectivamente. Estos marcadores se correlacionaron con niveles subjetivos de estrés (r = 0,32 con RMS), confirmando el valor del </w:t>
+      </w:r>
+      <w:proofErr w:type="spellStart"/>
+      <w:r>
+        <w:rPr>
+          <w:lang w:val="es-PE"/>
+        </w:rPr>
+        <w:t>sEMG</w:t>
+      </w:r>
+      <w:proofErr w:type="spellEnd"/>
+      <w:r>
+        <w:rPr>
+          <w:lang w:val="es-PE"/>
+        </w:rPr>
+        <w:t xml:space="preserve"> como parámetro objetivo para la detección de estados cognitivos alterados.</w:t>
       </w:r>
     </w:p>
     <w:p>
@@ -3565,7 +4146,21 @@
         <w:rPr>
           <w:lang w:val="es-PE"/>
         </w:rPr>
-        <w:t xml:space="preserve"> compararon la utilidad del sEMG extraído del trapecio superior frente al extraído de músculos faciales, en un estudio con 45 voluntarios sanos bajo estrés inducido. Los resultados mostraron que el trapecio superior es un sitio de detección de estrés superior al facial, debido a su estabilidad frente a movimientos naturales del rostro (habla, expresiones) y a su alta sensibilidad a la activación simpática. Esto tiene una implicancia práctica directa: en un sistema de uso previo al procedimiento quirúrgico, colocar el electrodo en el trapecio es operativamente viable y científicamente óptimo.</w:t>
+        <w:t xml:space="preserve"> compararon la utilidad del </w:t>
+      </w:r>
+      <w:proofErr w:type="spellStart"/>
+      <w:r>
+        <w:rPr>
+          <w:lang w:val="es-PE"/>
+        </w:rPr>
+        <w:t>sEMG</w:t>
+      </w:r>
+      <w:proofErr w:type="spellEnd"/>
+      <w:r>
+        <w:rPr>
+          <w:lang w:val="es-PE"/>
+        </w:rPr>
+        <w:t xml:space="preserve"> extraído del trapecio superior frente al extraído de músculos faciales, en un estudio con 45 voluntarios sanos bajo estrés inducido. Los resultados mostraron que el trapecio superior es un sitio de detección de estrés superior al facial, debido a su estabilidad frente a movimientos naturales del rostro (habla, expresiones) y a su alta sensibilidad a la activación simpática. Esto tiene una implicancia práctica directa: en un sistema de uso previo al procedimiento quirúrgico, colocar el electrodo en el trapecio es operativamente viable y científicamente óptimo.</w:t>
       </w:r>
     </w:p>
     <w:p>
@@ -3581,7 +4176,21 @@
         <w:rPr>
           <w:lang w:val="es-PE"/>
         </w:rPr>
-        <w:t xml:space="preserve">La evidencia más relevante para el presente trabajo proviene de Yu et al. </w:t>
+        <w:t xml:space="preserve">La evidencia más relevante para el presente trabajo proviene de </w:t>
+      </w:r>
+      <w:proofErr w:type="spellStart"/>
+      <w:r>
+        <w:rPr>
+          <w:lang w:val="es-PE"/>
+        </w:rPr>
+        <w:t>Yu</w:t>
+      </w:r>
+      <w:proofErr w:type="spellEnd"/>
+      <w:r>
+        <w:rPr>
+          <w:lang w:val="es-PE"/>
+        </w:rPr>
+        <w:t xml:space="preserve"> et al. </w:t>
       </w:r>
       <w:r>
         <w:rPr>
@@ -3614,7 +4223,63 @@
         <w:rPr>
           <w:lang w:val="es-PE"/>
         </w:rPr>
-        <w:t>, quienes midieron simultáneamente sEMG bilateral del trapecio (junto con bíceps, braquiorradial y flexor carpi ulnaris) y eye-tracking en 14 cirujanos durante colecistectomías laparoscópicas simuladas. El estudio demostró, mediante modelos mixtos de efectos, que los niveles de actividad muscular del trapecio se mantienen sostenidos durante todas las fases de la intervención y que la fatiga mental interfiere marcadamente con los movimientos operativos. Este hallazgo es directamente extrapolable a procedimientos oftalmológicos, donde la demanda de precisión visual y motora sostenida es comparable.</w:t>
+        <w:t xml:space="preserve">, quienes midieron simultáneamente </w:t>
+      </w:r>
+      <w:proofErr w:type="spellStart"/>
+      <w:r>
+        <w:rPr>
+          <w:lang w:val="es-PE"/>
+        </w:rPr>
+        <w:t>sEMG</w:t>
+      </w:r>
+      <w:proofErr w:type="spellEnd"/>
+      <w:r>
+        <w:rPr>
+          <w:lang w:val="es-PE"/>
+        </w:rPr>
+        <w:t xml:space="preserve"> bilateral del trapecio (junto con bíceps, braquiorradial y flexor </w:t>
+      </w:r>
+      <w:proofErr w:type="spellStart"/>
+      <w:r>
+        <w:rPr>
+          <w:lang w:val="es-PE"/>
+        </w:rPr>
+        <w:t>carpi</w:t>
+      </w:r>
+      <w:proofErr w:type="spellEnd"/>
+      <w:r>
+        <w:rPr>
+          <w:lang w:val="es-PE"/>
+        </w:rPr>
+        <w:t xml:space="preserve"> </w:t>
+      </w:r>
+      <w:proofErr w:type="spellStart"/>
+      <w:r>
+        <w:rPr>
+          <w:lang w:val="es-PE"/>
+        </w:rPr>
+        <w:t>ulnaris</w:t>
+      </w:r>
+      <w:proofErr w:type="spellEnd"/>
+      <w:r>
+        <w:rPr>
+          <w:lang w:val="es-PE"/>
+        </w:rPr>
+        <w:t xml:space="preserve">) y </w:t>
+      </w:r>
+      <w:proofErr w:type="spellStart"/>
+      <w:r>
+        <w:rPr>
+          <w:lang w:val="es-PE"/>
+        </w:rPr>
+        <w:t>eye</w:t>
+      </w:r>
+      <w:proofErr w:type="spellEnd"/>
+      <w:r>
+        <w:rPr>
+          <w:lang w:val="es-PE"/>
+        </w:rPr>
+        <w:t>-tracking en 14 cirujanos durante colecistectomías laparoscópicas simuladas. El estudio demostró, mediante modelos mixtos de efectos, que los niveles de actividad muscular del trapecio se mantienen sostenidos durante todas las fases de la intervención y que la fatiga mental interfiere marcadamente con los movimientos operativos. Este hallazgo es directamente extrapolable a procedimientos oftalmológicos, donde la demanda de precisión visual y motora sostenida es comparable.</w:t>
       </w:r>
     </w:p>
     <w:p>
@@ -3630,7 +4295,49 @@
         <w:rPr>
           <w:lang w:val="es-PE"/>
         </w:rPr>
-        <w:t xml:space="preserve">A partir de esta literatura, el sistema propuesto adopta el trapecio superior como sitio de medición sEMG, utiliza las métricas RMS y frecuencia mediana como indicadores principales, y compara los valores medidos contra un baseline personal del usuario (capturado en estado descansado), aplicando umbrales derivados de Wijsman et al. </w:t>
+        <w:t xml:space="preserve">A partir de esta literatura, el sistema propuesto adopta el trapecio superior como sitio de medición </w:t>
+      </w:r>
+      <w:proofErr w:type="spellStart"/>
+      <w:r>
+        <w:rPr>
+          <w:lang w:val="es-PE"/>
+        </w:rPr>
+        <w:t>sEMG</w:t>
+      </w:r>
+      <w:proofErr w:type="spellEnd"/>
+      <w:r>
+        <w:rPr>
+          <w:lang w:val="es-PE"/>
+        </w:rPr>
+        <w:t xml:space="preserve">, utiliza las métricas RMS y frecuencia mediana como indicadores principales, y compara los valores medidos contra un </w:t>
+      </w:r>
+      <w:proofErr w:type="spellStart"/>
+      <w:r>
+        <w:rPr>
+          <w:lang w:val="es-PE"/>
+        </w:rPr>
+        <w:t>baseline</w:t>
+      </w:r>
+      <w:proofErr w:type="spellEnd"/>
+      <w:r>
+        <w:rPr>
+          <w:lang w:val="es-PE"/>
+        </w:rPr>
+        <w:t xml:space="preserve"> personal del usuario (capturado en estado descansado), aplicando umbrales derivados de </w:t>
+      </w:r>
+      <w:proofErr w:type="spellStart"/>
+      <w:r>
+        <w:rPr>
+          <w:lang w:val="es-PE"/>
+        </w:rPr>
+        <w:t>Wijsman</w:t>
+      </w:r>
+      <w:proofErr w:type="spellEnd"/>
+      <w:r>
+        <w:rPr>
+          <w:lang w:val="es-PE"/>
+        </w:rPr>
+        <w:t xml:space="preserve"> et al. </w:t>
       </w:r>
       <w:r>
         <w:rPr>
@@ -3670,7 +4377,77 @@
           <w:lang w:val="es-PE"/>
         </w:rPr>
         <w:lastRenderedPageBreak/>
-        <w:t>al baseline o una disminución de frecuencia mediana mayor al 15 % se interpretan como indicadores de fatiga cognitiva elevada. Este enfoque se denomina "physiological rule-based classifier" en la literatura de sistemas embebidos médicos y presenta la ventaja de personalizarse por usuario sin requerir entrenamiento supervisado de un modelo de machine learning específico para EMG.</w:t>
+        <w:t xml:space="preserve">al </w:t>
+      </w:r>
+      <w:proofErr w:type="spellStart"/>
+      <w:r>
+        <w:rPr>
+          <w:lang w:val="es-PE"/>
+        </w:rPr>
+        <w:t>baseline</w:t>
+      </w:r>
+      <w:proofErr w:type="spellEnd"/>
+      <w:r>
+        <w:rPr>
+          <w:lang w:val="es-PE"/>
+        </w:rPr>
+        <w:t xml:space="preserve"> o una disminución de frecuencia mediana mayor al 15 % se interpretan como indicadores de fatiga cognitiva elevada. Este enfoque se denomina "</w:t>
+      </w:r>
+      <w:proofErr w:type="spellStart"/>
+      <w:r>
+        <w:rPr>
+          <w:lang w:val="es-PE"/>
+        </w:rPr>
+        <w:t>physiological</w:t>
+      </w:r>
+      <w:proofErr w:type="spellEnd"/>
+      <w:r>
+        <w:rPr>
+          <w:lang w:val="es-PE"/>
+        </w:rPr>
+        <w:t xml:space="preserve"> rule-</w:t>
+      </w:r>
+      <w:proofErr w:type="spellStart"/>
+      <w:r>
+        <w:rPr>
+          <w:lang w:val="es-PE"/>
+        </w:rPr>
+        <w:t>based</w:t>
+      </w:r>
+      <w:proofErr w:type="spellEnd"/>
+      <w:r>
+        <w:rPr>
+          <w:lang w:val="es-PE"/>
+        </w:rPr>
+        <w:t xml:space="preserve"> </w:t>
+      </w:r>
+      <w:proofErr w:type="spellStart"/>
+      <w:r>
+        <w:rPr>
+          <w:lang w:val="es-PE"/>
+        </w:rPr>
+        <w:t>classifier</w:t>
+      </w:r>
+      <w:proofErr w:type="spellEnd"/>
+      <w:r>
+        <w:rPr>
+          <w:lang w:val="es-PE"/>
+        </w:rPr>
+        <w:t xml:space="preserve">" en la literatura de sistemas embebidos médicos y presenta la ventaja de personalizarse por usuario sin requerir entrenamiento supervisado de un modelo de machine </w:t>
+      </w:r>
+      <w:proofErr w:type="spellStart"/>
+      <w:r>
+        <w:rPr>
+          <w:lang w:val="es-PE"/>
+        </w:rPr>
+        <w:t>learning</w:t>
+      </w:r>
+      <w:proofErr w:type="spellEnd"/>
+      <w:r>
+        <w:rPr>
+          <w:lang w:val="es-PE"/>
+        </w:rPr>
+        <w:t xml:space="preserve"> específico para EMG.</w:t>
       </w:r>
     </w:p>
     <w:p>
@@ -3686,7 +4463,35 @@
         <w:rPr>
           <w:lang w:val="es-PE"/>
         </w:rPr>
-        <w:t>La evidencia revisada permite establecer una separación funcional clara entre los módulos inteligentes del sistema: la visión artificial procesa biomarcadores conductuales (EAR, MAR, PERCLOS) asociados principalmente a somnolencia; el módulo fisiológico procesa sEMG del trapecio y HR/HRV extraídos por rPPG, asociados principalmente a fatiga mental y activación simpática; y un módulo de fusión tardía integra ambas probabilidades para emitir un dictamen clínicamente interpretable. Esta separación no solo es arquitectónicamente limpia, sino que refleja fielmente la diferencia conceptual entre somnolencia (estado conductual de vigilancia disminuida) y fatiga mental (estado fisiológico de agotamiento cognitivo).</w:t>
+        <w:t xml:space="preserve">La evidencia revisada permite establecer una separación funcional clara entre los módulos inteligentes del sistema: la visión artificial procesa biomarcadores conductuales (EAR, MAR, PERCLOS) asociados principalmente a somnolencia; el módulo fisiológico procesa </w:t>
+      </w:r>
+      <w:proofErr w:type="spellStart"/>
+      <w:r>
+        <w:rPr>
+          <w:lang w:val="es-PE"/>
+        </w:rPr>
+        <w:t>sEMG</w:t>
+      </w:r>
+      <w:proofErr w:type="spellEnd"/>
+      <w:r>
+        <w:rPr>
+          <w:lang w:val="es-PE"/>
+        </w:rPr>
+        <w:t xml:space="preserve"> del trapecio y HR/HRV extraídos por </w:t>
+      </w:r>
+      <w:proofErr w:type="spellStart"/>
+      <w:r>
+        <w:rPr>
+          <w:lang w:val="es-PE"/>
+        </w:rPr>
+        <w:t>rPPG</w:t>
+      </w:r>
+      <w:proofErr w:type="spellEnd"/>
+      <w:r>
+        <w:rPr>
+          <w:lang w:val="es-PE"/>
+        </w:rPr>
+        <w:t>, asociados principalmente a fatiga mental y activación simpática; y un módulo de fusión tardía integra ambas probabilidades para emitir un dictamen clínicamente interpretable. Esta separación no solo es arquitectónicamente limpia, sino que refleja fielmente la diferencia conceptual entre somnolencia (estado conductual de vigilancia disminuida) y fatiga mental (estado fisiológico de agotamiento cognitivo).</w:t>
       </w:r>
     </w:p>
     <w:p>
@@ -4482,7 +5287,23 @@
               </w:rPr>
             </w:pPr>
             <w:r>
-              <w:t>Investigación basada en el diseño (Design-Based Research)</w:t>
+              <w:t>Investigación basada en el diseño (</w:t>
+            </w:r>
+            <w:proofErr w:type="spellStart"/>
+            <w:r>
+              <w:t>Design-Based</w:t>
+            </w:r>
+            <w:proofErr w:type="spellEnd"/>
+            <w:r>
+              <w:t xml:space="preserve"> </w:t>
+            </w:r>
+            <w:proofErr w:type="spellStart"/>
+            <w:r>
+              <w:t>Research</w:t>
+            </w:r>
+            <w:proofErr w:type="spellEnd"/>
+            <w:r>
+              <w:t>)</w:t>
             </w:r>
           </w:p>
         </w:tc>
@@ -4810,7 +5631,15 @@
               </w:rPr>
             </w:pPr>
             <w:r>
-              <w:t>Fichas de análisis de artículos científicos, bases de datos WOS y Scopus.</w:t>
+              <w:t xml:space="preserve">Fichas de análisis de artículos científicos, bases de datos WOS y </w:t>
+            </w:r>
+            <w:proofErr w:type="spellStart"/>
+            <w:r>
+              <w:t>Scopus</w:t>
+            </w:r>
+            <w:proofErr w:type="spellEnd"/>
+            <w:r>
+              <w:t>.</w:t>
             </w:r>
           </w:p>
         </w:tc>
@@ -4884,7 +5713,23 @@
                     <w:jc w:val="both"/>
                   </w:pPr>
                   <w:r>
-                    <w:t>Prototipo embebido (Raspberry Pi o Arduino, sensores ECG/HRV, cámara), software de captura y análisis de datos (Python, OpenCV, TensorFlow).</w:t>
+                    <w:t xml:space="preserve">Prototipo embebido (Raspberry Pi o Arduino, sensores ECG/HRV, cámara), software de captura y análisis de datos (Python, </w:t>
+                  </w:r>
+                  <w:proofErr w:type="spellStart"/>
+                  <w:r>
+                    <w:t>OpenCV</w:t>
+                  </w:r>
+                  <w:proofErr w:type="spellEnd"/>
+                  <w:r>
+                    <w:t xml:space="preserve">, </w:t>
+                  </w:r>
+                  <w:proofErr w:type="spellStart"/>
+                  <w:r>
+                    <w:t>TensorFlow</w:t>
+                  </w:r>
+                  <w:proofErr w:type="spellEnd"/>
+                  <w:r>
+                    <w:t>).</w:t>
                   </w:r>
                 </w:p>
               </w:tc>
@@ -5115,7 +5960,49 @@
         <w:rPr>
           <w:lang w:val="es-PE"/>
         </w:rPr>
-        <w:t xml:space="preserve">El desarrollo del sistema inteligente propuesto se fundamentará principalmente en la metodología CRISP-DM (Cross Industry Standard Process for Data Mining), considerada el estándar de referencia en </w:t>
+        <w:t xml:space="preserve">El desarrollo del sistema inteligente propuesto se fundamentará principalmente en la metodología CRISP-DM (Cross </w:t>
+      </w:r>
+      <w:proofErr w:type="spellStart"/>
+      <w:r>
+        <w:rPr>
+          <w:lang w:val="es-PE"/>
+        </w:rPr>
+        <w:t>Industry</w:t>
+      </w:r>
+      <w:proofErr w:type="spellEnd"/>
+      <w:r>
+        <w:rPr>
+          <w:lang w:val="es-PE"/>
+        </w:rPr>
+        <w:t xml:space="preserve"> Standard Process </w:t>
+      </w:r>
+      <w:proofErr w:type="spellStart"/>
+      <w:r>
+        <w:rPr>
+          <w:lang w:val="es-PE"/>
+        </w:rPr>
+        <w:t>for</w:t>
+      </w:r>
+      <w:proofErr w:type="spellEnd"/>
+      <w:r>
+        <w:rPr>
+          <w:lang w:val="es-PE"/>
+        </w:rPr>
+        <w:t xml:space="preserve"> Data </w:t>
+      </w:r>
+      <w:proofErr w:type="spellStart"/>
+      <w:r>
+        <w:rPr>
+          <w:lang w:val="es-PE"/>
+        </w:rPr>
+        <w:t>Mining</w:t>
+      </w:r>
+      <w:proofErr w:type="spellEnd"/>
+      <w:r>
+        <w:rPr>
+          <w:lang w:val="es-PE"/>
+        </w:rPr>
+        <w:t xml:space="preserve">), considerada el estándar de referencia en </w:t>
       </w:r>
       <w:r>
         <w:rPr>
@@ -5337,7 +6224,21 @@
         <w:rPr>
           <w:lang w:val="es-PE"/>
         </w:rPr>
-        <w:t>En esta fase se analiza el contexto quirúrgico y la problemática relacionada con la somnolencia y la fatiga mental en cirujanos. Se definen los objetivos funcionales y técnicos del sistema, las restricciones del entorno hospitalario y los requerimientos para la adquisición de datos fisiológicos (HRV, sEMG) y conductuales. Asimismo, se delimitan las metas de investigación, los criterios de éxito y los indicadores de desempeño del sistema.</w:t>
+        <w:t xml:space="preserve">En esta fase se analiza el contexto quirúrgico y la problemática relacionada con la somnolencia y la fatiga mental en cirujanos. Se definen los objetivos funcionales y técnicos del sistema, las restricciones del entorno hospitalario y los requerimientos para la adquisición de datos fisiológicos (HRV, </w:t>
+      </w:r>
+      <w:proofErr w:type="spellStart"/>
+      <w:r>
+        <w:rPr>
+          <w:lang w:val="es-PE"/>
+        </w:rPr>
+        <w:t>sEMG</w:t>
+      </w:r>
+      <w:proofErr w:type="spellEnd"/>
+      <w:r>
+        <w:rPr>
+          <w:lang w:val="es-PE"/>
+        </w:rPr>
+        <w:t>) y conductuales. Asimismo, se delimitan las metas de investigación, los criterios de éxito y los indicadores de desempeño del sistema.</w:t>
       </w:r>
     </w:p>
     <w:p>
@@ -5476,6 +6377,12 @@
         <w:rPr>
           <w:lang w:val="es-PE"/>
         </w:rPr>
+        <w:t xml:space="preserve"> difusas</w:t>
+      </w:r>
+      <w:r>
+        <w:rPr>
+          <w:lang w:val="es-PE"/>
+        </w:rPr>
         <w:t>. Los parámetros de entrenamiento se ajustan de acuerdo con los resultados de validación cruzada y las métricas de desempeño (precisión, sensibilidad, F1-score y AUC-ROC).</w:t>
       </w:r>
     </w:p>
@@ -5544,7 +6451,21 @@
         <w:rPr>
           <w:lang w:val="es-PE"/>
         </w:rPr>
-        <w:t>Para la gestión de esta etapa se adopta el marco SCRUM, estructurando el desarrollo en sprints cortos orientados a</w:t>
+        <w:t xml:space="preserve">Para la gestión de esta etapa se adopta el marco SCRUM, estructurando el desarrollo en </w:t>
+      </w:r>
+      <w:proofErr w:type="spellStart"/>
+      <w:r>
+        <w:rPr>
+          <w:lang w:val="es-PE"/>
+        </w:rPr>
+        <w:t>sprints</w:t>
+      </w:r>
+      <w:proofErr w:type="spellEnd"/>
+      <w:r>
+        <w:rPr>
+          <w:lang w:val="es-PE"/>
+        </w:rPr>
+        <w:t xml:space="preserve"> cortos orientados a</w:t>
       </w:r>
       <w:r>
         <w:rPr>
@@ -5586,7 +6507,49 @@
         <w:rPr>
           <w:lang w:val="es-PE"/>
         </w:rPr>
-        <w:t>erán asumidos por el tesista (Scrum master, desarrollador y product owner)</w:t>
+        <w:t xml:space="preserve">erán asumidos por el tesista (Scrum </w:t>
+      </w:r>
+      <w:proofErr w:type="gramStart"/>
+      <w:r>
+        <w:rPr>
+          <w:lang w:val="es-PE"/>
+        </w:rPr>
+        <w:t>master</w:t>
+      </w:r>
+      <w:proofErr w:type="gramEnd"/>
+      <w:r>
+        <w:rPr>
+          <w:lang w:val="es-PE"/>
+        </w:rPr>
+        <w:t xml:space="preserve">, desarrollador y </w:t>
+      </w:r>
+      <w:proofErr w:type="spellStart"/>
+      <w:r>
+        <w:rPr>
+          <w:lang w:val="es-PE"/>
+        </w:rPr>
+        <w:t>product</w:t>
+      </w:r>
+      <w:proofErr w:type="spellEnd"/>
+      <w:r>
+        <w:rPr>
+          <w:lang w:val="es-PE"/>
+        </w:rPr>
+        <w:t xml:space="preserve"> </w:t>
+      </w:r>
+      <w:proofErr w:type="spellStart"/>
+      <w:r>
+        <w:rPr>
+          <w:lang w:val="es-PE"/>
+        </w:rPr>
+        <w:t>owner</w:t>
+      </w:r>
+      <w:proofErr w:type="spellEnd"/>
+      <w:r>
+        <w:rPr>
+          <w:lang w:val="es-PE"/>
+        </w:rPr>
+        <w:t>)</w:t>
       </w:r>
       <w:r>
         <w:rPr>
@@ -5647,7 +6610,35 @@
         <w:rPr>
           <w:lang w:val="es-PE"/>
         </w:rPr>
-        <w:t xml:space="preserve"> y la IEEE Computer Society </w:t>
+        <w:t xml:space="preserve"> y la IEEE </w:t>
+      </w:r>
+      <w:proofErr w:type="spellStart"/>
+      <w:r>
+        <w:rPr>
+          <w:lang w:val="es-PE"/>
+        </w:rPr>
+        <w:t>Computer</w:t>
+      </w:r>
+      <w:proofErr w:type="spellEnd"/>
+      <w:r>
+        <w:rPr>
+          <w:lang w:val="es-PE"/>
+        </w:rPr>
+        <w:t xml:space="preserve"> </w:t>
+      </w:r>
+      <w:proofErr w:type="spellStart"/>
+      <w:r>
+        <w:rPr>
+          <w:lang w:val="es-PE"/>
+        </w:rPr>
+        <w:t>Society</w:t>
+      </w:r>
+      <w:proofErr w:type="spellEnd"/>
+      <w:r>
+        <w:rPr>
+          <w:lang w:val="es-PE"/>
+        </w:rPr>
+        <w:t xml:space="preserve"> </w:t>
       </w:r>
       <w:r>
         <w:rPr>
@@ -6150,7 +7141,15 @@
               <w:t xml:space="preserve"> </w:t>
             </w:r>
             <w:r>
-              <w:t>Código fuente del modelo, dataset de entrenamiento y documentación técnica del proceso.</w:t>
+              <w:t xml:space="preserve">Código fuente del modelo, </w:t>
+            </w:r>
+            <w:proofErr w:type="spellStart"/>
+            <w:r>
+              <w:t>dataset</w:t>
+            </w:r>
+            <w:proofErr w:type="spellEnd"/>
+            <w:r>
+              <w:t xml:space="preserve"> de entrenamiento y documentación técnica del proceso.</w:t>
             </w:r>
           </w:p>
         </w:tc>
@@ -6182,8 +7181,21 @@
             <w:r>
               <w:t xml:space="preserve">Modelo funcional con arquitectura documentada y proceso de entrenamiento validado (incluye preprocesamiento, entrenamiento y </w:t>
             </w:r>
-            <w:r>
-              <w:t>hold out estratificado</w:t>
+            <w:proofErr w:type="spellStart"/>
+            <w:r>
+              <w:t>hold</w:t>
+            </w:r>
+            <w:proofErr w:type="spellEnd"/>
+            <w:r>
+              <w:t xml:space="preserve"> </w:t>
+            </w:r>
+            <w:proofErr w:type="spellStart"/>
+            <w:r>
+              <w:t>out</w:t>
+            </w:r>
+            <w:proofErr w:type="spellEnd"/>
+            <w:r>
+              <w:t xml:space="preserve"> estratificado</w:t>
             </w:r>
             <w:r>
               <w:t>).</w:t>
@@ -6421,10 +7433,20 @@
             </w:r>
             <w:r>
               <w:lastRenderedPageBreak/>
-              <w:t>métricas estándar.</w:t>
-            </w:r>
-            <w:r>
-              <w:t>entrenado y optimizado.</w:t>
+              <w:t xml:space="preserve">métricas </w:t>
+            </w:r>
+            <w:proofErr w:type="spellStart"/>
+            <w:proofErr w:type="gramStart"/>
+            <w:r>
+              <w:t>estándar.</w:t>
+            </w:r>
+            <w:r>
+              <w:t>entrenado</w:t>
+            </w:r>
+            <w:proofErr w:type="spellEnd"/>
+            <w:proofErr w:type="gramEnd"/>
+            <w:r>
+              <w:t xml:space="preserve"> y optimizado.</w:t>
             </w:r>
           </w:p>
         </w:tc>
@@ -6498,13 +7520,16 @@
               <w:t>Precisión ≥</w:t>
             </w:r>
             <w:r>
-              <w:t>80</w:t>
-            </w:r>
-            <w:r>
-              <w:t>%, sensibilidad ≥8</w:t>
+              <w:t>9</w:t>
             </w:r>
             <w:r>
               <w:t>0</w:t>
+            </w:r>
+            <w:r>
+              <w:t>%, sensibilidad ≥</w:t>
+            </w:r>
+            <w:r>
+              <w:t>85</w:t>
             </w:r>
             <w:r>
               <w:t xml:space="preserve">%, especificidad </w:t>
@@ -6514,7 +7539,7 @@
               <w:t>≥8</w:t>
             </w:r>
             <w:r>
-              <w:t>0</w:t>
+              <w:t>5</w:t>
             </w:r>
             <w:r>
               <w:t>%, y análisis estadístico completo documentado.</w:t>
@@ -7166,7 +8191,21 @@
         <w:rPr>
           <w:lang w:val="es-PE"/>
         </w:rPr>
-        <w:t>Un módulo inteligente clasificador basado en reglas con baseline personal.</w:t>
+        <w:t xml:space="preserve">Un módulo inteligente clasificador basado en reglas con </w:t>
+      </w:r>
+      <w:proofErr w:type="spellStart"/>
+      <w:r>
+        <w:rPr>
+          <w:lang w:val="es-PE"/>
+        </w:rPr>
+        <w:t>baseline</w:t>
+      </w:r>
+      <w:proofErr w:type="spellEnd"/>
+      <w:r>
+        <w:rPr>
+          <w:lang w:val="es-PE"/>
+        </w:rPr>
+        <w:t xml:space="preserve"> personal.</w:t>
       </w:r>
     </w:p>
     <w:p>
@@ -7187,7 +8226,21 @@
           <w:lang w:val="es-PE"/>
         </w:rPr>
         <w:lastRenderedPageBreak/>
-        <w:t>Módulo de fusión tardía y veredicto final de las dos probabilidades obtenidas de los módulos anteriores.</w:t>
+        <w:t xml:space="preserve">Módulo de fusión tardía y </w:t>
+      </w:r>
+      <w:proofErr w:type="gramStart"/>
+      <w:r>
+        <w:rPr>
+          <w:lang w:val="es-PE"/>
+        </w:rPr>
+        <w:t>veredicto final</w:t>
+      </w:r>
+      <w:proofErr w:type="gramEnd"/>
+      <w:r>
+        <w:rPr>
+          <w:lang w:val="es-PE"/>
+        </w:rPr>
+        <w:t xml:space="preserve"> de las dos probabilidades obtenidas de los módulos anteriores.</w:t>
       </w:r>
     </w:p>
     <w:p>
@@ -7242,7 +8295,15 @@
         <w:spacing w:line="360" w:lineRule="auto"/>
       </w:pPr>
       <w:r>
-        <w:t>RF-01: El sistema deberá capturar video facial del usuario mediante la cámara integrada de la laptop, durante una ventana de evaluación de 30 segundos a 30 fps con resolución mínima de 640×480 píxeles.</w:t>
+        <w:t xml:space="preserve">RF-01: El sistema deberá capturar video facial del usuario mediante la cámara integrada de la laptop, durante una ventana de evaluación de 30 segundos a 30 </w:t>
+      </w:r>
+      <w:proofErr w:type="spellStart"/>
+      <w:r>
+        <w:t>fps</w:t>
+      </w:r>
+      <w:proofErr w:type="spellEnd"/>
+      <w:r>
+        <w:t xml:space="preserve"> con resolución mínima de 640×480 píxeles.</w:t>
       </w:r>
     </w:p>
     <w:p>
@@ -7255,7 +8316,15 @@
         <w:spacing w:line="360" w:lineRule="auto"/>
       </w:pPr>
       <w:r>
-        <w:t>RF-02: El sistema deberá capturar la señal de electromiografía de superficie del trapecio superior mediante el sensor Olimex conectado al Arduino UNO, con una frecuencia de muestreo de 500 Hz, durante el mismo intervalo de 30 segundos.</w:t>
+        <w:t xml:space="preserve">RF-02: El sistema deberá capturar la señal de electromiografía de superficie del trapecio superior mediante el sensor </w:t>
+      </w:r>
+      <w:proofErr w:type="spellStart"/>
+      <w:r>
+        <w:t>Olimex</w:t>
+      </w:r>
+      <w:proofErr w:type="spellEnd"/>
+      <w:r>
+        <w:t xml:space="preserve"> conectado al Arduino UNO, con una frecuencia de muestreo de 500 Hz, durante el mismo intervalo de 30 segundos.</w:t>
       </w:r>
     </w:p>
     <w:p>
@@ -7268,7 +8337,15 @@
         <w:spacing w:line="360" w:lineRule="auto"/>
       </w:pPr>
       <w:r>
-        <w:t>RF-03: El sistema deberá permitir una fase de calibración inicial por usuario, en la que se capture una muestra en estado descansado para establecer los valores de baseline de EMG (RMS, frecuencia mediana) y HRV (SDNN, RMSSD, pNN50).</w:t>
+        <w:t xml:space="preserve">RF-03: El sistema deberá permitir una fase de calibración inicial por usuario, en la que se capture una muestra en estado descansado para establecer los valores de </w:t>
+      </w:r>
+      <w:proofErr w:type="spellStart"/>
+      <w:r>
+        <w:t>baseline</w:t>
+      </w:r>
+      <w:proofErr w:type="spellEnd"/>
+      <w:r>
+        <w:t xml:space="preserve"> de EMG (RMS, frecuencia mediana) y HRV (SDNN, RMSSD, pNN50).</w:t>
       </w:r>
     </w:p>
     <w:p>
@@ -7294,7 +8371,41 @@
         <w:spacing w:line="360" w:lineRule="auto"/>
       </w:pPr>
       <w:r>
-        <w:t>RF-04: El sistema deberá extraer los landmarks faciales de cada frame utilizando MediaPipe FaceMesh (468 puntos).</w:t>
+        <w:t xml:space="preserve">RF-04: El sistema deberá extraer los </w:t>
+      </w:r>
+      <w:proofErr w:type="spellStart"/>
+      <w:r>
+        <w:t>landmarks</w:t>
+      </w:r>
+      <w:proofErr w:type="spellEnd"/>
+      <w:r>
+        <w:t xml:space="preserve"> faciales de cada </w:t>
+      </w:r>
+      <w:proofErr w:type="spellStart"/>
+      <w:proofErr w:type="gramStart"/>
+      <w:r>
+        <w:t>frame</w:t>
+      </w:r>
+      <w:proofErr w:type="spellEnd"/>
+      <w:proofErr w:type="gramEnd"/>
+      <w:r>
+        <w:t xml:space="preserve"> utilizando </w:t>
+      </w:r>
+      <w:proofErr w:type="spellStart"/>
+      <w:r>
+        <w:t>MediaPipe</w:t>
+      </w:r>
+      <w:proofErr w:type="spellEnd"/>
+      <w:r>
+        <w:t xml:space="preserve"> </w:t>
+      </w:r>
+      <w:proofErr w:type="spellStart"/>
+      <w:r>
+        <w:t>FaceMesh</w:t>
+      </w:r>
+      <w:proofErr w:type="spellEnd"/>
+      <w:r>
+        <w:t xml:space="preserve"> (468 puntos).</w:t>
       </w:r>
     </w:p>
     <w:p>
@@ -7307,7 +8418,17 @@
         <w:spacing w:line="360" w:lineRule="auto"/>
       </w:pPr>
       <w:r>
-        <w:t>RF-05: El sistema deberá calcular los indicadores conductuales EAR, MAR, PERCLOS y pose de la cabeza para cada frame procesado.</w:t>
+        <w:t xml:space="preserve">RF-05: El sistema deberá calcular los indicadores conductuales EAR, MAR, PERCLOS y pose de la cabeza para cada </w:t>
+      </w:r>
+      <w:proofErr w:type="spellStart"/>
+      <w:proofErr w:type="gramStart"/>
+      <w:r>
+        <w:t>frame</w:t>
+      </w:r>
+      <w:proofErr w:type="spellEnd"/>
+      <w:proofErr w:type="gramEnd"/>
+      <w:r>
+        <w:t xml:space="preserve"> procesado.</w:t>
       </w:r>
     </w:p>
     <w:p>
@@ -7346,7 +8467,15 @@
         <w:spacing w:line="360" w:lineRule="auto"/>
       </w:pPr>
       <w:r>
-        <w:t>RF-07: El sistema deberá aplicar un filtro pasa-banda Butterworth de orden 4 entre 20 Hz y 200 Hz sobre la señal EMG antes de extraer features.</w:t>
+        <w:t xml:space="preserve">RF-07: El sistema deberá aplicar un filtro pasa-banda Butterworth de orden 4 entre 20 Hz y 200 Hz sobre la señal EMG antes de extraer </w:t>
+      </w:r>
+      <w:proofErr w:type="spellStart"/>
+      <w:r>
+        <w:t>features</w:t>
+      </w:r>
+      <w:proofErr w:type="spellEnd"/>
+      <w:r>
+        <w:t>.</w:t>
       </w:r>
     </w:p>
     <w:p>
@@ -7373,7 +8502,23 @@
         <w:spacing w:line="360" w:lineRule="auto"/>
       </w:pPr>
       <w:r>
-        <w:t>RF-09: El sistema deberá extraer la señal de frecuencia cardíaca desde el video facial mediante rPPG (fotopletismografía remota) y calcular las métricas de HRV (SDNN, RMSSD, pNN50).</w:t>
+        <w:t xml:space="preserve">RF-09: El sistema deberá extraer la señal de frecuencia cardíaca desde el video facial mediante </w:t>
+      </w:r>
+      <w:proofErr w:type="spellStart"/>
+      <w:r>
+        <w:t>rPPG</w:t>
+      </w:r>
+      <w:proofErr w:type="spellEnd"/>
+      <w:r>
+        <w:t xml:space="preserve"> (</w:t>
+      </w:r>
+      <w:proofErr w:type="spellStart"/>
+      <w:r>
+        <w:t>fotopletismografía</w:t>
+      </w:r>
+      <w:proofErr w:type="spellEnd"/>
+      <w:r>
+        <w:t xml:space="preserve"> remota) y calcular las métricas de HRV (SDNN, RMSSD, pNN50).</w:t>
       </w:r>
     </w:p>
     <w:p>
@@ -7386,7 +8531,15 @@
         <w:spacing w:line="360" w:lineRule="auto"/>
       </w:pPr>
       <w:r>
-        <w:t>RF-10: El sistema deberá comparar las métricas fisiológicas contra el baseline personal del usuario y aplicar las reglas basadas en umbrales de literatura para retornar una probabilidad de fatiga fisiológica en el rango [0, 1].</w:t>
+        <w:t xml:space="preserve">RF-10: El sistema deberá comparar las métricas fisiológicas contra el </w:t>
+      </w:r>
+      <w:proofErr w:type="spellStart"/>
+      <w:r>
+        <w:t>baseline</w:t>
+      </w:r>
+      <w:proofErr w:type="spellEnd"/>
+      <w:r>
+        <w:t xml:space="preserve"> personal del usuario y aplicar las reglas basadas en umbrales de literatura para retornar una probabilidad de fatiga fisiológica en el rango [0, 1].</w:t>
       </w:r>
     </w:p>
     <w:p>
@@ -7490,7 +8643,15 @@
         <w:spacing w:line="360" w:lineRule="auto"/>
       </w:pPr>
       <w:r>
-        <w:t>RF-16: El sistema deberá almacenar cada sesión de evaluación en base de datos con la identidad del usuario, sellos de tiempo, probabilidades, features crudos y dictamen final.</w:t>
+        <w:t xml:space="preserve">RF-16: El sistema deberá almacenar cada sesión de evaluación en base de datos con la identidad del usuario, sellos de tiempo, probabilidades, </w:t>
+      </w:r>
+      <w:proofErr w:type="spellStart"/>
+      <w:r>
+        <w:t>features</w:t>
+      </w:r>
+      <w:proofErr w:type="spellEnd"/>
+      <w:r>
+        <w:t xml:space="preserve"> crudos y dictamen final.</w:t>
       </w:r>
     </w:p>
     <w:p>
@@ -7562,7 +8723,15 @@
         <w:t>0</w:t>
       </w:r>
       <w:r>
-        <w:t xml:space="preserve"> % en la clasificación binaria (somnolencia / no somnolencia) medida sobre el conjunto de prueba del dataset </w:t>
+        <w:t xml:space="preserve"> % en la clasificación binaria (somnolencia / no somnolencia) medida sobre el conjunto de prueba del </w:t>
+      </w:r>
+      <w:proofErr w:type="spellStart"/>
+      <w:r>
+        <w:t>dataset</w:t>
+      </w:r>
+      <w:proofErr w:type="spellEnd"/>
+      <w:r>
+        <w:t xml:space="preserve"> </w:t>
       </w:r>
       <w:r>
         <w:t>verificado</w:t>
@@ -7581,7 +8750,15 @@
         <w:spacing w:line="360" w:lineRule="auto"/>
       </w:pPr>
       <w:r>
-        <w:t>RNF-03 (Confiabilidad del Módulo 2): El Módulo 2 deberá detectar correctamente un incremento sostenido de RMS mayor al 20 % o una caída de frecuencia mediana mayor al 15 % respecto al baseline, verificado mediante pruebas controladas de inducción de fatiga.</w:t>
+        <w:t xml:space="preserve">RNF-03 (Confiabilidad del Módulo 2): El Módulo 2 deberá detectar correctamente un incremento sostenido de RMS mayor al 20 % o una caída de frecuencia mediana mayor al 15 % respecto al </w:t>
+      </w:r>
+      <w:proofErr w:type="spellStart"/>
+      <w:r>
+        <w:t>baseline</w:t>
+      </w:r>
+      <w:proofErr w:type="spellEnd"/>
+      <w:r>
+        <w:t>, verificado mediante pruebas controladas de inducción de fatiga.</w:t>
       </w:r>
     </w:p>
     <w:p>
@@ -7594,7 +8771,23 @@
         <w:spacing w:line="360" w:lineRule="auto"/>
       </w:pPr>
       <w:r>
-        <w:t>RNF-04 (Interpretabilidad): La justificación que acompaña al dictamen deberá mostrar de forma explícita el valor numérico de P_somnolencia, P_fatiga_fisiológica y P_total, de modo que el usuario pueda entender el origen de la decisión.</w:t>
+        <w:t xml:space="preserve">RNF-04 (Interpretabilidad): La justificación que acompaña al dictamen deberá mostrar de forma explícita el valor numérico de </w:t>
+      </w:r>
+      <w:proofErr w:type="spellStart"/>
+      <w:r>
+        <w:t>P_somnolencia</w:t>
+      </w:r>
+      <w:proofErr w:type="spellEnd"/>
+      <w:r>
+        <w:t xml:space="preserve">, P_fatiga_fisiológica y </w:t>
+      </w:r>
+      <w:proofErr w:type="spellStart"/>
+      <w:r>
+        <w:t>P_total</w:t>
+      </w:r>
+      <w:proofErr w:type="spellEnd"/>
+      <w:r>
+        <w:t>, de modo que el usuario pueda entender el origen de la decisión.</w:t>
       </w:r>
     </w:p>
     <w:p>
@@ -7607,7 +8800,15 @@
         <w:spacing w:line="360" w:lineRule="auto"/>
       </w:pPr>
       <w:r>
-        <w:t>RNF-05 (Personalización): El sistema deberá operar sobre un baseline personal por usuario, almacenado durante la fase de calibración, garantizando que los umbrales se interpreten de forma individualizada.</w:t>
+        <w:t xml:space="preserve">RNF-05 (Personalización): El sistema deberá operar sobre un </w:t>
+      </w:r>
+      <w:proofErr w:type="spellStart"/>
+      <w:r>
+        <w:t>baseline</w:t>
+      </w:r>
+      <w:proofErr w:type="spellEnd"/>
+      <w:r>
+        <w:t xml:space="preserve"> personal por usuario, almacenado durante la fase de calibración, garantizando que los umbrales se interpreten de forma individualizada.</w:t>
       </w:r>
     </w:p>
     <w:p>
@@ -7620,7 +8821,15 @@
         <w:spacing w:line="360" w:lineRule="auto"/>
       </w:pPr>
       <w:r>
-        <w:t>RNF-06 (Usabilidad): La interfaz web deberá permitir completar un flujo estándar de evaluación (login → iniciar → ver resultado) en no más de cinco clics.</w:t>
+        <w:t>RNF-06 (Usabilidad): La interfaz web deberá permitir completar un flujo estándar de evaluación (</w:t>
+      </w:r>
+      <w:proofErr w:type="spellStart"/>
+      <w:r>
+        <w:t>login</w:t>
+      </w:r>
+      <w:proofErr w:type="spellEnd"/>
+      <w:r>
+        <w:t xml:space="preserve"> → iniciar → ver resultado) en no más de cinco clics.</w:t>
       </w:r>
     </w:p>
     <w:p>
@@ -7646,11 +8855,43 @@
         <w:spacing w:line="360" w:lineRule="auto"/>
       </w:pPr>
       <w:r>
-        <w:t xml:space="preserve">RNF-08 (Seguridad): Las contraseñas deberán almacenarse con hash bcrypt, las sesiones HTTP usarán JWT con </w:t>
+        <w:t xml:space="preserve">RNF-08 (Seguridad): Las contraseñas deberán almacenarse con hash </w:t>
+      </w:r>
+      <w:proofErr w:type="spellStart"/>
+      <w:r>
+        <w:t>bcrypt</w:t>
+      </w:r>
+      <w:proofErr w:type="spellEnd"/>
+      <w:r>
+        <w:t xml:space="preserve">, las sesiones HTTP usarán JWT con </w:t>
       </w:r>
       <w:r>
         <w:lastRenderedPageBreak/>
-        <w:t>expiración de 60 minutos y todos los endpoints (excepto /auth/login) requerirán autenticación.</w:t>
+        <w:t xml:space="preserve">expiración de 60 minutos y todos los </w:t>
+      </w:r>
+      <w:proofErr w:type="spellStart"/>
+      <w:r>
+        <w:t>endpoints</w:t>
+      </w:r>
+      <w:proofErr w:type="spellEnd"/>
+      <w:r>
+        <w:t xml:space="preserve"> (excepto /</w:t>
+      </w:r>
+      <w:proofErr w:type="spellStart"/>
+      <w:r>
+        <w:t>auth</w:t>
+      </w:r>
+      <w:proofErr w:type="spellEnd"/>
+      <w:r>
+        <w:t>/</w:t>
+      </w:r>
+      <w:proofErr w:type="spellStart"/>
+      <w:r>
+        <w:t>login</w:t>
+      </w:r>
+      <w:proofErr w:type="spellEnd"/>
+      <w:r>
+        <w:t>) requerirán autenticación.</w:t>
       </w:r>
     </w:p>
     <w:p>
@@ -7663,7 +8904,39 @@
         <w:spacing w:line="360" w:lineRule="auto"/>
       </w:pPr>
       <w:r>
-        <w:t>RNF-09 (Mantenibilidad): El código deberá organizarse en módulos separados (frontend React, backend FastAPI, Módulo IA, Módulo EMG, Módulo fusión) con documentación mínima por módulo (README).</w:t>
+        <w:t>RNF-09 (Mantenibilidad): El código deberá organizarse en módulos separados (</w:t>
+      </w:r>
+      <w:proofErr w:type="spellStart"/>
+      <w:r>
+        <w:t>frontend</w:t>
+      </w:r>
+      <w:proofErr w:type="spellEnd"/>
+      <w:r>
+        <w:t xml:space="preserve"> </w:t>
+      </w:r>
+      <w:proofErr w:type="spellStart"/>
+      <w:r>
+        <w:t>React</w:t>
+      </w:r>
+      <w:proofErr w:type="spellEnd"/>
+      <w:r>
+        <w:t xml:space="preserve">, </w:t>
+      </w:r>
+      <w:proofErr w:type="spellStart"/>
+      <w:r>
+        <w:t>backend</w:t>
+      </w:r>
+      <w:proofErr w:type="spellEnd"/>
+      <w:r>
+        <w:t xml:space="preserve"> </w:t>
+      </w:r>
+      <w:proofErr w:type="spellStart"/>
+      <w:r>
+        <w:t>FastAPI</w:t>
+      </w:r>
+      <w:proofErr w:type="spellEnd"/>
+      <w:r>
+        <w:t>, Módulo IA, Módulo EMG, Módulo fusión) con documentación mínima por módulo (README).</w:t>
       </w:r>
     </w:p>
     <w:p>
@@ -7689,7 +8962,15 @@
         <w:spacing w:line="360" w:lineRule="auto"/>
       </w:pPr>
       <w:r>
-        <w:t>RNF-11 (Trazabilidad): Todas las operaciones relevantes (login, creación de sesión, dictamen emitido) deberán registrarse en un log persistente con sello de tiempo y usuario.</w:t>
+        <w:t>RNF-11 (Trazabilidad): Todas las operaciones relevantes (</w:t>
+      </w:r>
+      <w:proofErr w:type="spellStart"/>
+      <w:r>
+        <w:t>login</w:t>
+      </w:r>
+      <w:proofErr w:type="spellEnd"/>
+      <w:r>
+        <w:t>, creación de sesión, dictamen emitido) deberán registrarse en un log persistente con sello de tiempo y usuario.</w:t>
       </w:r>
     </w:p>
     <w:p>
@@ -7702,7 +8983,23 @@
         <w:spacing w:line="360" w:lineRule="auto"/>
       </w:pPr>
       <w:r>
-        <w:t>RNF-12 (Escalabilidad arquitectónica): La arquitectura del sistema deberá permitir la sustitución de la laptop por un dispositivo embebido dedicado (Raspberry Pi 5, Jetson Nano) sin modificar el código del backend ni del frontend, mediante la misma API REST.</w:t>
+        <w:t xml:space="preserve">RNF-12 (Escalabilidad arquitectónica): La arquitectura del sistema deberá permitir la sustitución de la laptop por un dispositivo embebido dedicado (Raspberry Pi 5, Jetson Nano) sin modificar el código del </w:t>
+      </w:r>
+      <w:proofErr w:type="spellStart"/>
+      <w:r>
+        <w:t>backend</w:t>
+      </w:r>
+      <w:proofErr w:type="spellEnd"/>
+      <w:r>
+        <w:t xml:space="preserve"> ni del </w:t>
+      </w:r>
+      <w:proofErr w:type="spellStart"/>
+      <w:r>
+        <w:t>frontend</w:t>
+      </w:r>
+      <w:proofErr w:type="spellEnd"/>
+      <w:r>
+        <w:t>, mediante la misma API REST.</w:t>
       </w:r>
     </w:p>
     <w:p>
@@ -8070,6 +9367,7 @@
         </w:rPr>
         <w:t>. Interfaz “</w:t>
       </w:r>
+      <w:proofErr w:type="spellStart"/>
       <w:r>
         <w:rPr>
           <w:i w:val="0"/>
@@ -8078,6 +9376,7 @@
         </w:rPr>
         <w:t>Dashboard</w:t>
       </w:r>
+      <w:proofErr w:type="spellEnd"/>
       <w:r>
         <w:rPr>
           <w:i w:val="0"/>
@@ -8351,7 +9650,15 @@
         <w:t>Esta pantalla permitirá</w:t>
       </w:r>
       <w:r>
-        <w:t xml:space="preserve"> gestionar los usuarios que ingresen al sistema así como los roles que tienen dentro de este</w:t>
+        <w:t xml:space="preserve"> gestionar los usuarios que ingresen al </w:t>
+      </w:r>
+      <w:proofErr w:type="gramStart"/>
+      <w:r>
+        <w:t>sistema</w:t>
+      </w:r>
+      <w:proofErr w:type="gramEnd"/>
+      <w:r>
+        <w:t xml:space="preserve"> así como los roles que tienen dentro de este</w:t>
       </w:r>
     </w:p>
     <w:p>
@@ -8648,7 +9955,35 @@
         <w:rPr>
           <w:lang w:val="es-PE"/>
         </w:rPr>
-        <w:t>El sistema se estructura en tres capas: una capa de adquisición de señales, una capa de procesamiento local compuesta por tres módulos inteligentes y una capa de aplicación web para la interacción con el usuario final y la persistencia de datos. El procesamiento de todas las señales se ejecuta localmente en una laptop que funciona como unidad embebida dedicada, siguiendo el paradigma de edge computing.</w:t>
+        <w:t xml:space="preserve">El sistema se estructura en tres capas: una capa de adquisición de señales, una capa de procesamiento local compuesta por tres módulos inteligentes y una capa de aplicación web para la interacción con el usuario final y la persistencia de datos. El procesamiento de todas las señales se ejecuta localmente en una laptop que funciona como unidad embebida dedicada, siguiendo el paradigma de </w:t>
+      </w:r>
+      <w:proofErr w:type="spellStart"/>
+      <w:r>
+        <w:rPr>
+          <w:lang w:val="es-PE"/>
+        </w:rPr>
+        <w:t>edge</w:t>
+      </w:r>
+      <w:proofErr w:type="spellEnd"/>
+      <w:r>
+        <w:rPr>
+          <w:lang w:val="es-PE"/>
+        </w:rPr>
+        <w:t xml:space="preserve"> </w:t>
+      </w:r>
+      <w:proofErr w:type="spellStart"/>
+      <w:r>
+        <w:rPr>
+          <w:lang w:val="es-PE"/>
+        </w:rPr>
+        <w:t>computing</w:t>
+      </w:r>
+      <w:proofErr w:type="spellEnd"/>
+      <w:r>
+        <w:rPr>
+          <w:lang w:val="es-PE"/>
+        </w:rPr>
+        <w:t>.</w:t>
       </w:r>
     </w:p>
     <w:p>
@@ -8682,15 +10017,65 @@
         <w:rPr>
           <w:lang w:val="es-PE"/>
         </w:rPr>
-        <w:t xml:space="preserve">La capa de adquisición integra cuatro componentes físicos. La cámara integrada de la laptop captura video facial a 30 fps con resolución mínima de 640×480 píxeles, gestionada mediante la MediaDevices API desde el navegador. El microcontrolador Arduino UNO digitaliza la señal analógica del sensor de electromiografía mediante su ADC de 10 bits operando a 500 Hz en el pin A0, y transmite las muestras a la laptop a través del puerto Serial a 115 200 baudios. El sensor Olimex SHIELD-EKG-EMG recibe la señal bioeléctrica, la amplifica y filtra por hardware en el rango 20–500 Hz, entregando una señal analógica proporcional a la actividad muscular. Finalmente, los electrodos de superficie </w:t>
+        <w:t xml:space="preserve">La capa de adquisición integra cuatro componentes físicos. La cámara integrada de la laptop captura video facial a 30 </w:t>
+      </w:r>
+      <w:proofErr w:type="spellStart"/>
+      <w:r>
+        <w:rPr>
+          <w:lang w:val="es-PE"/>
+        </w:rPr>
+        <w:t>fps</w:t>
+      </w:r>
+      <w:proofErr w:type="spellEnd"/>
+      <w:r>
+        <w:rPr>
+          <w:lang w:val="es-PE"/>
+        </w:rPr>
+        <w:t xml:space="preserve"> con resolución mínima de 640×480 píxeles, gestionada mediante la </w:t>
+      </w:r>
+      <w:proofErr w:type="spellStart"/>
+      <w:r>
+        <w:rPr>
+          <w:lang w:val="es-PE"/>
+        </w:rPr>
+        <w:t>MediaDevices</w:t>
+      </w:r>
+      <w:proofErr w:type="spellEnd"/>
+      <w:r>
+        <w:rPr>
+          <w:lang w:val="es-PE"/>
+        </w:rPr>
+        <w:t xml:space="preserve"> API desde el navegador. El microcontrolador Arduino UNO digitaliza la señal analógica del sensor de electromiografía mediante su ADC de 10 bits operando a 500 Hz en el pin A0, y transmite las muestras a la laptop a través del puerto Serial a 115 200 baudios. El sensor </w:t>
+      </w:r>
+      <w:proofErr w:type="spellStart"/>
+      <w:r>
+        <w:rPr>
+          <w:lang w:val="es-PE"/>
+        </w:rPr>
+        <w:t>Olimex</w:t>
+      </w:r>
+      <w:proofErr w:type="spellEnd"/>
+      <w:r>
+        <w:rPr>
+          <w:lang w:val="es-PE"/>
+        </w:rPr>
+        <w:t xml:space="preserve"> SHIELD-EKG-EMG recibe la señal bioeléctrica, la amplifica y filtra por hardware en el rango 20–500 Hz, entregando una señal analógica proporcional a la actividad muscular. Finalmente, los electrodos de superficie </w:t>
       </w:r>
       <w:r>
         <w:rPr>
           <w:lang w:val="es-PE"/>
         </w:rPr>
         <w:lastRenderedPageBreak/>
-        <w:t>Ag/AgCl se colocan sobre el trapecio superior del usuario (músculo del lado dominante), siguiendo las recomendaciones de colocación SENIAM, y se conectan al sensor mediante un cable con broches de 3,5 mm.</w:t>
-      </w:r>
+        <w:t xml:space="preserve">Ag/AgCl se colocan sobre el trapecio superior del usuario (músculo del lado dominante), siguiendo las recomendaciones de colocación SENIAM, y se conectan al sensor mediante un cable con broches de 3,5 </w:t>
+      </w:r>
+      <w:proofErr w:type="spellStart"/>
+      <w:r>
+        <w:rPr>
+          <w:lang w:val="es-PE"/>
+        </w:rPr>
+        <w:t>mm.</w:t>
+      </w:r>
+      <w:proofErr w:type="spellEnd"/>
     </w:p>
     <w:p>
       <w:pPr>
@@ -8725,7 +10110,175 @@
         <w:rPr>
           <w:lang w:val="es-PE"/>
         </w:rPr>
-        <w:t xml:space="preserve">El primer módulo inteligente procesa la señal de video para detectar somnolencia. Recibe los frames capturados durante la ventana de evaluación de 30 segundos y ejecuta el siguiente pipeline: (i) extracción de 468 landmarks faciales por frame usando MediaPipe FaceMesh; (ii) cálculo de los indicadores conductuales EAR (Eye Aspect Ratio), MAR (Mouth Aspect Ratio), PERCLOS (porcentaje de cierre ocular) y pose de la cabeza; (iii) aplicación del modelo de aprendizaje profundo ganador (seleccionado de la comparativa entre CNN, LSTM y ViT realizada en el objetivo específico 2) para obtener una probabilidad de somnolencia. La salida de este módulo es un valor continuo P_somnolencia </w:t>
+        <w:t xml:space="preserve">El primer módulo inteligente procesa la señal de video para detectar somnolencia. Recibe los </w:t>
+      </w:r>
+      <w:proofErr w:type="spellStart"/>
+      <w:r>
+        <w:rPr>
+          <w:lang w:val="es-PE"/>
+        </w:rPr>
+        <w:t>frames</w:t>
+      </w:r>
+      <w:proofErr w:type="spellEnd"/>
+      <w:r>
+        <w:rPr>
+          <w:lang w:val="es-PE"/>
+        </w:rPr>
+        <w:t xml:space="preserve"> capturados durante la ventana de evaluación de 30 segundos y ejecuta el siguiente pipeline: (i) extracción de 468 </w:t>
+      </w:r>
+      <w:proofErr w:type="spellStart"/>
+      <w:r>
+        <w:rPr>
+          <w:lang w:val="es-PE"/>
+        </w:rPr>
+        <w:t>landmarks</w:t>
+      </w:r>
+      <w:proofErr w:type="spellEnd"/>
+      <w:r>
+        <w:rPr>
+          <w:lang w:val="es-PE"/>
+        </w:rPr>
+        <w:t xml:space="preserve"> faciales por </w:t>
+      </w:r>
+      <w:proofErr w:type="spellStart"/>
+      <w:r>
+        <w:rPr>
+          <w:lang w:val="es-PE"/>
+        </w:rPr>
+        <w:t>frame</w:t>
+      </w:r>
+      <w:proofErr w:type="spellEnd"/>
+      <w:r>
+        <w:rPr>
+          <w:lang w:val="es-PE"/>
+        </w:rPr>
+        <w:t xml:space="preserve"> usando </w:t>
+      </w:r>
+      <w:proofErr w:type="spellStart"/>
+      <w:r>
+        <w:rPr>
+          <w:lang w:val="es-PE"/>
+        </w:rPr>
+        <w:t>MediaPipe</w:t>
+      </w:r>
+      <w:proofErr w:type="spellEnd"/>
+      <w:r>
+        <w:rPr>
+          <w:lang w:val="es-PE"/>
+        </w:rPr>
+        <w:t xml:space="preserve"> </w:t>
+      </w:r>
+      <w:proofErr w:type="spellStart"/>
+      <w:r>
+        <w:rPr>
+          <w:lang w:val="es-PE"/>
+        </w:rPr>
+        <w:t>FaceMesh</w:t>
+      </w:r>
+      <w:proofErr w:type="spellEnd"/>
+      <w:r>
+        <w:rPr>
+          <w:lang w:val="es-PE"/>
+        </w:rPr>
+        <w:t>; (</w:t>
+      </w:r>
+      <w:proofErr w:type="spellStart"/>
+      <w:r>
+        <w:rPr>
+          <w:lang w:val="es-PE"/>
+        </w:rPr>
+        <w:t>ii</w:t>
+      </w:r>
+      <w:proofErr w:type="spellEnd"/>
+      <w:r>
+        <w:rPr>
+          <w:lang w:val="es-PE"/>
+        </w:rPr>
+        <w:t xml:space="preserve">) cálculo de los indicadores conductuales EAR (Eye </w:t>
+      </w:r>
+      <w:proofErr w:type="spellStart"/>
+      <w:r>
+        <w:rPr>
+          <w:lang w:val="es-PE"/>
+        </w:rPr>
+        <w:t>Aspect</w:t>
+      </w:r>
+      <w:proofErr w:type="spellEnd"/>
+      <w:r>
+        <w:rPr>
+          <w:lang w:val="es-PE"/>
+        </w:rPr>
+        <w:t xml:space="preserve"> Ratio), MAR (</w:t>
+      </w:r>
+      <w:proofErr w:type="spellStart"/>
+      <w:r>
+        <w:rPr>
+          <w:lang w:val="es-PE"/>
+        </w:rPr>
+        <w:t>Mouth</w:t>
+      </w:r>
+      <w:proofErr w:type="spellEnd"/>
+      <w:r>
+        <w:rPr>
+          <w:lang w:val="es-PE"/>
+        </w:rPr>
+        <w:t xml:space="preserve"> </w:t>
+      </w:r>
+      <w:proofErr w:type="spellStart"/>
+      <w:r>
+        <w:rPr>
+          <w:lang w:val="es-PE"/>
+        </w:rPr>
+        <w:t>Aspect</w:t>
+      </w:r>
+      <w:proofErr w:type="spellEnd"/>
+      <w:r>
+        <w:rPr>
+          <w:lang w:val="es-PE"/>
+        </w:rPr>
+        <w:t xml:space="preserve"> Ratio), PERCLOS (porcentaje de cierre ocular) y pose de la cabeza; (</w:t>
+      </w:r>
+      <w:proofErr w:type="spellStart"/>
+      <w:r>
+        <w:rPr>
+          <w:lang w:val="es-PE"/>
+        </w:rPr>
+        <w:t>iii</w:t>
+      </w:r>
+      <w:proofErr w:type="spellEnd"/>
+      <w:r>
+        <w:rPr>
+          <w:lang w:val="es-PE"/>
+        </w:rPr>
+        <w:t xml:space="preserve">) aplicación del modelo de aprendizaje profundo ganador (seleccionado de la comparativa entre CNN, LSTM y </w:t>
+      </w:r>
+      <w:proofErr w:type="spellStart"/>
+      <w:r>
+        <w:rPr>
+          <w:lang w:val="es-PE"/>
+        </w:rPr>
+        <w:t>ViT</w:t>
+      </w:r>
+      <w:proofErr w:type="spellEnd"/>
+      <w:r>
+        <w:rPr>
+          <w:lang w:val="es-PE"/>
+        </w:rPr>
+        <w:t xml:space="preserve"> realizada en el objetivo específico 2) para obtener una probabilidad de somnolencia. La salida de este módulo es un valor continuo </w:t>
+      </w:r>
+      <w:proofErr w:type="spellStart"/>
+      <w:r>
+        <w:rPr>
+          <w:lang w:val="es-PE"/>
+        </w:rPr>
+        <w:t>P_somnolencia</w:t>
+      </w:r>
+      <w:proofErr w:type="spellEnd"/>
+      <w:r>
+        <w:rPr>
+          <w:lang w:val="es-PE"/>
+        </w:rPr>
+        <w:t xml:space="preserve"> </w:t>
       </w:r>
       <w:r>
         <w:rPr>
@@ -8758,7 +10311,25 @@
           <w:bCs/>
           <w:lang w:val="es-PE"/>
         </w:rPr>
-        <w:t>Módulo 2 - Fisiológico (clasificador basado en reglas con baseline personal)</w:t>
+        <w:t xml:space="preserve">Módulo 2 - Fisiológico (clasificador basado en reglas con </w:t>
+      </w:r>
+      <w:proofErr w:type="spellStart"/>
+      <w:r>
+        <w:rPr>
+          <w:b/>
+          <w:bCs/>
+          <w:lang w:val="es-PE"/>
+        </w:rPr>
+        <w:t>baseline</w:t>
+      </w:r>
+      <w:proofErr w:type="spellEnd"/>
+      <w:r>
+        <w:rPr>
+          <w:b/>
+          <w:bCs/>
+          <w:lang w:val="es-PE"/>
+        </w:rPr>
+        <w:t xml:space="preserve"> personal)</w:t>
       </w:r>
     </w:p>
     <w:p>
@@ -8774,7 +10345,161 @@
         <w:rPr>
           <w:lang w:val="es-PE"/>
         </w:rPr>
-        <w:t xml:space="preserve">El segundo módulo inteligente procesa las señales fisiológicas para detectar fatiga mental. Recibe dos entradas: la señal sEMG cruda desde el Arduino y el mismo video capturado por la cámara, del cual se extrae la señal de frecuencia cardíaca mediante fotopletismografía remota (rPPG) analizando cambios sutiles de color en la piel del rostro. El pipeline comprende: (i) aplicación de un filtro pasa-banda Butterworth de orden 4 entre 20 Hz y 200 Hz sobre la señal EMG; (ii) extracción de features EMG (RMS, frecuencia mediana, frecuencia media); (iii) extracción de features HRV (SDNN, RMSSD, pNN50) a partir de la señal rPPG; (iv) comparación de los valores obtenidos contra el baseline personal del usuario, almacenado previamente en base de datos durante una fase de calibración; (v) aplicación de reglas fisiológicas derivadas de literatura: un incremento de RMS mayor al 20 % o una caída de frecuencia mediana mayor al 15 % respecto al baseline, así como caídas significativas en indicadores de HRV, se interpretan como evidencia de fatiga mental. La salida es una probabilidad P_fatiga_fisiológica </w:t>
+        <w:t xml:space="preserve">El segundo módulo inteligente procesa las señales fisiológicas para detectar fatiga mental. Recibe dos entradas: la señal </w:t>
+      </w:r>
+      <w:proofErr w:type="spellStart"/>
+      <w:r>
+        <w:rPr>
+          <w:lang w:val="es-PE"/>
+        </w:rPr>
+        <w:t>sEMG</w:t>
+      </w:r>
+      <w:proofErr w:type="spellEnd"/>
+      <w:r>
+        <w:rPr>
+          <w:lang w:val="es-PE"/>
+        </w:rPr>
+        <w:t xml:space="preserve"> cruda desde el Arduino y el mismo video capturado por la cámara, del cual se extrae la señal de frecuencia cardíaca mediante </w:t>
+      </w:r>
+      <w:proofErr w:type="spellStart"/>
+      <w:r>
+        <w:rPr>
+          <w:lang w:val="es-PE"/>
+        </w:rPr>
+        <w:t>fotopletismografía</w:t>
+      </w:r>
+      <w:proofErr w:type="spellEnd"/>
+      <w:r>
+        <w:rPr>
+          <w:lang w:val="es-PE"/>
+        </w:rPr>
+        <w:t xml:space="preserve"> remota (</w:t>
+      </w:r>
+      <w:proofErr w:type="spellStart"/>
+      <w:r>
+        <w:rPr>
+          <w:lang w:val="es-PE"/>
+        </w:rPr>
+        <w:t>rPPG</w:t>
+      </w:r>
+      <w:proofErr w:type="spellEnd"/>
+      <w:r>
+        <w:rPr>
+          <w:lang w:val="es-PE"/>
+        </w:rPr>
+        <w:t>) analizando cambios sutiles de color en la piel del rostro. El pipeline comprende: (i) aplicación de un filtro pasa-banda Butterworth de orden 4 entre 20 Hz y 200 Hz sobre la señal EMG; (</w:t>
+      </w:r>
+      <w:proofErr w:type="spellStart"/>
+      <w:r>
+        <w:rPr>
+          <w:lang w:val="es-PE"/>
+        </w:rPr>
+        <w:t>ii</w:t>
+      </w:r>
+      <w:proofErr w:type="spellEnd"/>
+      <w:r>
+        <w:rPr>
+          <w:lang w:val="es-PE"/>
+        </w:rPr>
+        <w:t xml:space="preserve">) extracción de </w:t>
+      </w:r>
+      <w:proofErr w:type="spellStart"/>
+      <w:r>
+        <w:rPr>
+          <w:lang w:val="es-PE"/>
+        </w:rPr>
+        <w:t>features</w:t>
+      </w:r>
+      <w:proofErr w:type="spellEnd"/>
+      <w:r>
+        <w:rPr>
+          <w:lang w:val="es-PE"/>
+        </w:rPr>
+        <w:t xml:space="preserve"> EMG (RMS, frecuencia mediana, frecuencia media); (</w:t>
+      </w:r>
+      <w:proofErr w:type="spellStart"/>
+      <w:r>
+        <w:rPr>
+          <w:lang w:val="es-PE"/>
+        </w:rPr>
+        <w:t>iii</w:t>
+      </w:r>
+      <w:proofErr w:type="spellEnd"/>
+      <w:r>
+        <w:rPr>
+          <w:lang w:val="es-PE"/>
+        </w:rPr>
+        <w:t xml:space="preserve">) extracción de </w:t>
+      </w:r>
+      <w:proofErr w:type="spellStart"/>
+      <w:r>
+        <w:rPr>
+          <w:lang w:val="es-PE"/>
+        </w:rPr>
+        <w:t>features</w:t>
+      </w:r>
+      <w:proofErr w:type="spellEnd"/>
+      <w:r>
+        <w:rPr>
+          <w:lang w:val="es-PE"/>
+        </w:rPr>
+        <w:t xml:space="preserve"> HRV (SDNN, RMSSD, pNN50) a partir de la señal </w:t>
+      </w:r>
+      <w:proofErr w:type="spellStart"/>
+      <w:r>
+        <w:rPr>
+          <w:lang w:val="es-PE"/>
+        </w:rPr>
+        <w:t>rPPG</w:t>
+      </w:r>
+      <w:proofErr w:type="spellEnd"/>
+      <w:r>
+        <w:rPr>
+          <w:lang w:val="es-PE"/>
+        </w:rPr>
+        <w:t>; (</w:t>
+      </w:r>
+      <w:proofErr w:type="spellStart"/>
+      <w:r>
+        <w:rPr>
+          <w:lang w:val="es-PE"/>
+        </w:rPr>
+        <w:t>iv</w:t>
+      </w:r>
+      <w:proofErr w:type="spellEnd"/>
+      <w:r>
+        <w:rPr>
+          <w:lang w:val="es-PE"/>
+        </w:rPr>
+        <w:t xml:space="preserve">) comparación de los valores obtenidos contra el </w:t>
+      </w:r>
+      <w:proofErr w:type="spellStart"/>
+      <w:r>
+        <w:rPr>
+          <w:lang w:val="es-PE"/>
+        </w:rPr>
+        <w:t>baseline</w:t>
+      </w:r>
+      <w:proofErr w:type="spellEnd"/>
+      <w:r>
+        <w:rPr>
+          <w:lang w:val="es-PE"/>
+        </w:rPr>
+        <w:t xml:space="preserve"> personal del usuario, almacenado previamente en base de datos durante una fase de calibración; (v) aplicación de reglas fisiológicas derivadas de literatura: un incremento de RMS mayor al 20 % o una caída de frecuencia mediana mayor al 15 % respecto al </w:t>
+      </w:r>
+      <w:proofErr w:type="spellStart"/>
+      <w:r>
+        <w:rPr>
+          <w:lang w:val="es-PE"/>
+        </w:rPr>
+        <w:t>baseline</w:t>
+      </w:r>
+      <w:proofErr w:type="spellEnd"/>
+      <w:r>
+        <w:rPr>
+          <w:lang w:val="es-PE"/>
+        </w:rPr>
+        <w:t xml:space="preserve">, así como caídas significativas en indicadores de HRV, se interpretan como evidencia de fatiga mental. La salida es una probabilidad P_fatiga_fisiológica </w:t>
       </w:r>
       <w:r>
         <w:rPr>
@@ -8799,14 +10524,56 @@
         <w:rPr>
           <w:lang w:val="es-PE"/>
         </w:rPr>
-        <w:t xml:space="preserve">La decisión de usar un clasificador basado en reglas en lugar de un modelo de aprendizaje profundo entrenado para este módulo responde a dos razones: primero, no existen datasets públicos de sEMG etiquetados para fatiga mental en cirujanos que permitan un entrenamiento </w:t>
+        <w:t xml:space="preserve">La decisión de usar un clasificador basado en reglas en lugar de un modelo de aprendizaje profundo entrenado para este módulo responde a dos razones: primero, no existen </w:t>
+      </w:r>
+      <w:proofErr w:type="spellStart"/>
+      <w:r>
+        <w:rPr>
+          <w:lang w:val="es-PE"/>
+        </w:rPr>
+        <w:t>datasets</w:t>
+      </w:r>
+      <w:proofErr w:type="spellEnd"/>
+      <w:r>
+        <w:rPr>
+          <w:lang w:val="es-PE"/>
+        </w:rPr>
+        <w:t xml:space="preserve"> públicos de </w:t>
+      </w:r>
+      <w:proofErr w:type="spellStart"/>
+      <w:r>
+        <w:rPr>
+          <w:lang w:val="es-PE"/>
+        </w:rPr>
+        <w:t>sEMG</w:t>
+      </w:r>
+      <w:proofErr w:type="spellEnd"/>
+      <w:r>
+        <w:rPr>
+          <w:lang w:val="es-PE"/>
+        </w:rPr>
+        <w:t xml:space="preserve"> etiquetados para fatiga mental en cirujanos que permitan un entrenamiento </w:t>
       </w:r>
       <w:r>
         <w:rPr>
           <w:lang w:val="es-PE"/>
         </w:rPr>
         <w:lastRenderedPageBreak/>
-        <w:t>supervisado confiable; segundo, el enfoque basado en umbrales personalizados al baseline del usuario se encuentra ampliamente documentado y validado en la literatura de sistemas embebidos fisiológicos, y tiene la ventaja de ser interpretable, auditable y personalizado por usuario sin requerir reentrenamiento.</w:t>
+        <w:t xml:space="preserve">supervisado confiable; segundo, el enfoque basado en umbrales personalizados al </w:t>
+      </w:r>
+      <w:proofErr w:type="spellStart"/>
+      <w:r>
+        <w:rPr>
+          <w:lang w:val="es-PE"/>
+        </w:rPr>
+        <w:t>baseline</w:t>
+      </w:r>
+      <w:proofErr w:type="spellEnd"/>
+      <w:r>
+        <w:rPr>
+          <w:lang w:val="es-PE"/>
+        </w:rPr>
+        <w:t xml:space="preserve"> del usuario se encuentra ampliamente documentado y validado en la literatura de sistemas embebidos fisiológicos, y tiene la ventaja de ser interpretable, auditable y personalizado por usuario sin requerir reentrenamiento.</w:t>
       </w:r>
     </w:p>
     <w:p>
@@ -8842,7 +10609,91 @@
         <w:rPr>
           <w:lang w:val="es-PE"/>
         </w:rPr>
-        <w:t xml:space="preserve">El tercer módulo inteligente ejecuta la fusión tardía (late fusion) de las dos probabilidades anteriores y emite el dictamen final. La lógica de fusión combina dos estrategias: (i) una ponderación lineal P_total = 0,40·P_somnolencia + 0,60·P_fatiga_fisiológica, asignando mayor peso a la señal fisiológica por ser más difícil de simular conscientemente que los indicadores conductuales; (ii) una regla OR para señales de alta confianza, por la cual si cualquiera de las dos probabilidades excede 0,85 el dictamen se emite directamente sin ponderación. El resultado se clasifica en tres niveles: APTO (P_total &lt; 0,35), ATENCIÓN (0,35 ≤ P_total &lt; 0,65) y NO APTO (P_total ≥ 0,65). El dictamen se acompaña de una justificación que detalla los aportes individuales de cada módulo, con el fin de ofrecer </w:t>
+        <w:t xml:space="preserve">El tercer módulo inteligente ejecuta la fusión tardía (late </w:t>
+      </w:r>
+      <w:proofErr w:type="spellStart"/>
+      <w:r>
+        <w:rPr>
+          <w:lang w:val="es-PE"/>
+        </w:rPr>
+        <w:t>fusion</w:t>
+      </w:r>
+      <w:proofErr w:type="spellEnd"/>
+      <w:r>
+        <w:rPr>
+          <w:lang w:val="es-PE"/>
+        </w:rPr>
+        <w:t xml:space="preserve">) de las dos probabilidades anteriores y emite el dictamen final. La lógica de fusión combina dos estrategias: (i) una ponderación lineal </w:t>
+      </w:r>
+      <w:proofErr w:type="spellStart"/>
+      <w:r>
+        <w:rPr>
+          <w:lang w:val="es-PE"/>
+        </w:rPr>
+        <w:t>P_total</w:t>
+      </w:r>
+      <w:proofErr w:type="spellEnd"/>
+      <w:r>
+        <w:rPr>
+          <w:lang w:val="es-PE"/>
+        </w:rPr>
+        <w:t xml:space="preserve"> = 0,40·P_somnolencia + 0,60·P_fatiga_fisiológica, asignando mayor peso a la señal fisiológica por ser más difícil de simular conscientemente que los indicadores conductuales; (</w:t>
+      </w:r>
+      <w:proofErr w:type="spellStart"/>
+      <w:r>
+        <w:rPr>
+          <w:lang w:val="es-PE"/>
+        </w:rPr>
+        <w:t>ii</w:t>
+      </w:r>
+      <w:proofErr w:type="spellEnd"/>
+      <w:r>
+        <w:rPr>
+          <w:lang w:val="es-PE"/>
+        </w:rPr>
+        <w:t>) una regla OR para señales de alta confianza, por la cual si cualquiera de las dos probabilidades excede 0,85 el dictamen se emite directamente sin ponderación. El resultado se clasifica en tres niveles: APTO (</w:t>
+      </w:r>
+      <w:proofErr w:type="spellStart"/>
+      <w:r>
+        <w:rPr>
+          <w:lang w:val="es-PE"/>
+        </w:rPr>
+        <w:t>P_total</w:t>
+      </w:r>
+      <w:proofErr w:type="spellEnd"/>
+      <w:r>
+        <w:rPr>
+          <w:lang w:val="es-PE"/>
+        </w:rPr>
+        <w:t xml:space="preserve"> &lt; 0,35), ATENCIÓN (0,35 ≤ </w:t>
+      </w:r>
+      <w:proofErr w:type="spellStart"/>
+      <w:r>
+        <w:rPr>
+          <w:lang w:val="es-PE"/>
+        </w:rPr>
+        <w:t>P_total</w:t>
+      </w:r>
+      <w:proofErr w:type="spellEnd"/>
+      <w:r>
+        <w:rPr>
+          <w:lang w:val="es-PE"/>
+        </w:rPr>
+        <w:t xml:space="preserve"> &lt; 0,65) y NO APTO (</w:t>
+      </w:r>
+      <w:proofErr w:type="spellStart"/>
+      <w:r>
+        <w:rPr>
+          <w:lang w:val="es-PE"/>
+        </w:rPr>
+        <w:t>P_total</w:t>
+      </w:r>
+      <w:proofErr w:type="spellEnd"/>
+      <w:r>
+        <w:rPr>
+          <w:lang w:val="es-PE"/>
+        </w:rPr>
+        <w:t xml:space="preserve"> ≥ 0,65). El dictamen se acompaña de una justificación que detalla los aportes individuales de cada módulo, con el fin de ofrecer </w:t>
       </w:r>
       <w:r>
         <w:rPr>
@@ -8890,7 +10741,287 @@
         <w:rPr>
           <w:lang w:val="es-PE"/>
         </w:rPr>
-        <w:t>El frontend se implementa en React 19 con Vite y TailwindCSS, y proporciona cinco vistas principales: Login, Dashboard, Evaluación, Resultado y panel de Administración. La captura de video se realiza desde el navegador mediante la API MediaDevices, y los datos se envían al backend como FormData vía axios. El backend FastAPI, desarrollado en Python 3.11 sobre Uvicorn, expone los endpoints REST necesarios para la autenticación, gestión de sesiones, calibración del baseline y consulta de historial. El backend orquesta la ejecución secuencial de los tres módulos inteligentes sobre los datos recibidos y persiste los resultados en la base de datos. PostgreSQL 16 almacena cuatro tablas principales: users (con credenciales hash y rol), baselines (valores basales de EMG y HRV por usuario), sessions (metadatos de cada evaluación) y results (probabilidades, features crudos y dictamen final). La capa de seguridad implementa bcrypt para el hash de contraseñas, JWT con expiración de 60 minutos para la gestión de sesiones HTTP y RBAC para diferenciar permisos entre los roles médico y administrador. Los logs de todas las operaciones permiten trazabilidad completa por usuario.</w:t>
+        <w:t xml:space="preserve">El </w:t>
+      </w:r>
+      <w:proofErr w:type="spellStart"/>
+      <w:r>
+        <w:rPr>
+          <w:lang w:val="es-PE"/>
+        </w:rPr>
+        <w:t>frontend</w:t>
+      </w:r>
+      <w:proofErr w:type="spellEnd"/>
+      <w:r>
+        <w:rPr>
+          <w:lang w:val="es-PE"/>
+        </w:rPr>
+        <w:t xml:space="preserve"> se implementa en </w:t>
+      </w:r>
+      <w:proofErr w:type="spellStart"/>
+      <w:r>
+        <w:rPr>
+          <w:lang w:val="es-PE"/>
+        </w:rPr>
+        <w:t>React</w:t>
+      </w:r>
+      <w:proofErr w:type="spellEnd"/>
+      <w:r>
+        <w:rPr>
+          <w:lang w:val="es-PE"/>
+        </w:rPr>
+        <w:t xml:space="preserve"> 19 con Vite y </w:t>
+      </w:r>
+      <w:proofErr w:type="spellStart"/>
+      <w:r>
+        <w:rPr>
+          <w:lang w:val="es-PE"/>
+        </w:rPr>
+        <w:t>TailwindCSS</w:t>
+      </w:r>
+      <w:proofErr w:type="spellEnd"/>
+      <w:r>
+        <w:rPr>
+          <w:lang w:val="es-PE"/>
+        </w:rPr>
+        <w:t xml:space="preserve">, y proporciona cinco vistas principales: Login, </w:t>
+      </w:r>
+      <w:proofErr w:type="spellStart"/>
+      <w:r>
+        <w:rPr>
+          <w:lang w:val="es-PE"/>
+        </w:rPr>
+        <w:t>Dashboard</w:t>
+      </w:r>
+      <w:proofErr w:type="spellEnd"/>
+      <w:r>
+        <w:rPr>
+          <w:lang w:val="es-PE"/>
+        </w:rPr>
+        <w:t xml:space="preserve">, Evaluación, Resultado y panel de Administración. La captura de video se realiza desde el navegador mediante la API </w:t>
+      </w:r>
+      <w:proofErr w:type="spellStart"/>
+      <w:r>
+        <w:rPr>
+          <w:lang w:val="es-PE"/>
+        </w:rPr>
+        <w:t>MediaDevices</w:t>
+      </w:r>
+      <w:proofErr w:type="spellEnd"/>
+      <w:r>
+        <w:rPr>
+          <w:lang w:val="es-PE"/>
+        </w:rPr>
+        <w:t xml:space="preserve">, y los datos se envían al </w:t>
+      </w:r>
+      <w:proofErr w:type="spellStart"/>
+      <w:r>
+        <w:rPr>
+          <w:lang w:val="es-PE"/>
+        </w:rPr>
+        <w:t>backend</w:t>
+      </w:r>
+      <w:proofErr w:type="spellEnd"/>
+      <w:r>
+        <w:rPr>
+          <w:lang w:val="es-PE"/>
+        </w:rPr>
+        <w:t xml:space="preserve"> como </w:t>
+      </w:r>
+      <w:proofErr w:type="spellStart"/>
+      <w:r>
+        <w:rPr>
+          <w:lang w:val="es-PE"/>
+        </w:rPr>
+        <w:t>FormData</w:t>
+      </w:r>
+      <w:proofErr w:type="spellEnd"/>
+      <w:r>
+        <w:rPr>
+          <w:lang w:val="es-PE"/>
+        </w:rPr>
+        <w:t xml:space="preserve"> vía </w:t>
+      </w:r>
+      <w:proofErr w:type="spellStart"/>
+      <w:r>
+        <w:rPr>
+          <w:lang w:val="es-PE"/>
+        </w:rPr>
+        <w:t>axios</w:t>
+      </w:r>
+      <w:proofErr w:type="spellEnd"/>
+      <w:r>
+        <w:rPr>
+          <w:lang w:val="es-PE"/>
+        </w:rPr>
+        <w:t xml:space="preserve">. El </w:t>
+      </w:r>
+      <w:proofErr w:type="spellStart"/>
+      <w:r>
+        <w:rPr>
+          <w:lang w:val="es-PE"/>
+        </w:rPr>
+        <w:t>backend</w:t>
+      </w:r>
+      <w:proofErr w:type="spellEnd"/>
+      <w:r>
+        <w:rPr>
+          <w:lang w:val="es-PE"/>
+        </w:rPr>
+        <w:t xml:space="preserve"> </w:t>
+      </w:r>
+      <w:proofErr w:type="spellStart"/>
+      <w:r>
+        <w:rPr>
+          <w:lang w:val="es-PE"/>
+        </w:rPr>
+        <w:t>FastAPI</w:t>
+      </w:r>
+      <w:proofErr w:type="spellEnd"/>
+      <w:r>
+        <w:rPr>
+          <w:lang w:val="es-PE"/>
+        </w:rPr>
+        <w:t xml:space="preserve">, desarrollado en Python 3.11 sobre </w:t>
+      </w:r>
+      <w:proofErr w:type="spellStart"/>
+      <w:r>
+        <w:rPr>
+          <w:lang w:val="es-PE"/>
+        </w:rPr>
+        <w:t>Uvicorn</w:t>
+      </w:r>
+      <w:proofErr w:type="spellEnd"/>
+      <w:r>
+        <w:rPr>
+          <w:lang w:val="es-PE"/>
+        </w:rPr>
+        <w:t xml:space="preserve">, expone los </w:t>
+      </w:r>
+      <w:proofErr w:type="spellStart"/>
+      <w:r>
+        <w:rPr>
+          <w:lang w:val="es-PE"/>
+        </w:rPr>
+        <w:t>endpoints</w:t>
+      </w:r>
+      <w:proofErr w:type="spellEnd"/>
+      <w:r>
+        <w:rPr>
+          <w:lang w:val="es-PE"/>
+        </w:rPr>
+        <w:t xml:space="preserve"> REST necesarios para la autenticación, gestión de sesiones, calibración del </w:t>
+      </w:r>
+      <w:proofErr w:type="spellStart"/>
+      <w:r>
+        <w:rPr>
+          <w:lang w:val="es-PE"/>
+        </w:rPr>
+        <w:t>baseline</w:t>
+      </w:r>
+      <w:proofErr w:type="spellEnd"/>
+      <w:r>
+        <w:rPr>
+          <w:lang w:val="es-PE"/>
+        </w:rPr>
+        <w:t xml:space="preserve"> y consulta de historial. El </w:t>
+      </w:r>
+      <w:proofErr w:type="spellStart"/>
+      <w:r>
+        <w:rPr>
+          <w:lang w:val="es-PE"/>
+        </w:rPr>
+        <w:t>backend</w:t>
+      </w:r>
+      <w:proofErr w:type="spellEnd"/>
+      <w:r>
+        <w:rPr>
+          <w:lang w:val="es-PE"/>
+        </w:rPr>
+        <w:t xml:space="preserve"> orquesta la ejecución secuencial de los tres módulos inteligentes sobre los datos recibidos y persiste los resultados en la base de datos. PostgreSQL 16 almacena cuatro tablas principales: </w:t>
+      </w:r>
+      <w:proofErr w:type="spellStart"/>
+      <w:r>
+        <w:rPr>
+          <w:lang w:val="es-PE"/>
+        </w:rPr>
+        <w:t>users</w:t>
+      </w:r>
+      <w:proofErr w:type="spellEnd"/>
+      <w:r>
+        <w:rPr>
+          <w:lang w:val="es-PE"/>
+        </w:rPr>
+        <w:t xml:space="preserve"> (con credenciales hash y rol), </w:t>
+      </w:r>
+      <w:proofErr w:type="spellStart"/>
+      <w:r>
+        <w:rPr>
+          <w:lang w:val="es-PE"/>
+        </w:rPr>
+        <w:t>baselines</w:t>
+      </w:r>
+      <w:proofErr w:type="spellEnd"/>
+      <w:r>
+        <w:rPr>
+          <w:lang w:val="es-PE"/>
+        </w:rPr>
+        <w:t xml:space="preserve"> (valores basales de EMG y HRV por usuario), </w:t>
+      </w:r>
+      <w:proofErr w:type="spellStart"/>
+      <w:r>
+        <w:rPr>
+          <w:lang w:val="es-PE"/>
+        </w:rPr>
+        <w:t>sessions</w:t>
+      </w:r>
+      <w:proofErr w:type="spellEnd"/>
+      <w:r>
+        <w:rPr>
+          <w:lang w:val="es-PE"/>
+        </w:rPr>
+        <w:t xml:space="preserve"> (metadatos de cada evaluación) y </w:t>
+      </w:r>
+      <w:proofErr w:type="spellStart"/>
+      <w:r>
+        <w:rPr>
+          <w:lang w:val="es-PE"/>
+        </w:rPr>
+        <w:t>results</w:t>
+      </w:r>
+      <w:proofErr w:type="spellEnd"/>
+      <w:r>
+        <w:rPr>
+          <w:lang w:val="es-PE"/>
+        </w:rPr>
+        <w:t xml:space="preserve"> (probabilidades, </w:t>
+      </w:r>
+      <w:proofErr w:type="spellStart"/>
+      <w:r>
+        <w:rPr>
+          <w:lang w:val="es-PE"/>
+        </w:rPr>
+        <w:t>features</w:t>
+      </w:r>
+      <w:proofErr w:type="spellEnd"/>
+      <w:r>
+        <w:rPr>
+          <w:lang w:val="es-PE"/>
+        </w:rPr>
+        <w:t xml:space="preserve"> crudos y dictamen final). La capa de seguridad implementa </w:t>
+      </w:r>
+      <w:proofErr w:type="spellStart"/>
+      <w:r>
+        <w:rPr>
+          <w:lang w:val="es-PE"/>
+        </w:rPr>
+        <w:t>bcrypt</w:t>
+      </w:r>
+      <w:proofErr w:type="spellEnd"/>
+      <w:r>
+        <w:rPr>
+          <w:lang w:val="es-PE"/>
+        </w:rPr>
+        <w:t xml:space="preserve"> para el hash de contraseñas, JWT con expiración de 60 minutos para la gestión de sesiones HTTP y RBAC para diferenciar permisos entre los roles médico y administrador. Los logs de todas las operaciones permiten trazabilidad completa por usuario.</w:t>
       </w:r>
     </w:p>
     <w:p>
@@ -8931,7 +11062,21 @@
           <w:lang w:val="es-PE"/>
         </w:rPr>
         <w:lastRenderedPageBreak/>
-        <w:t>El médico se autentica en la página web (React 19) mediante correo y contraseña.</w:t>
+        <w:t>El médico se autentica en la página web (</w:t>
+      </w:r>
+      <w:proofErr w:type="spellStart"/>
+      <w:r>
+        <w:rPr>
+          <w:lang w:val="es-PE"/>
+        </w:rPr>
+        <w:t>React</w:t>
+      </w:r>
+      <w:proofErr w:type="spellEnd"/>
+      <w:r>
+        <w:rPr>
+          <w:lang w:val="es-PE"/>
+        </w:rPr>
+        <w:t xml:space="preserve"> 19) mediante correo y contraseña.</w:t>
       </w:r>
     </w:p>
     <w:p>
@@ -8951,7 +11096,63 @@
         <w:rPr>
           <w:lang w:val="es-PE"/>
         </w:rPr>
-        <w:t>El frontend envía las credenciales al backend (FastAPI), que valida el hash bcrypt y devuelve un JWT.</w:t>
+        <w:t xml:space="preserve">El </w:t>
+      </w:r>
+      <w:proofErr w:type="spellStart"/>
+      <w:r>
+        <w:rPr>
+          <w:lang w:val="es-PE"/>
+        </w:rPr>
+        <w:t>frontend</w:t>
+      </w:r>
+      <w:proofErr w:type="spellEnd"/>
+      <w:r>
+        <w:rPr>
+          <w:lang w:val="es-PE"/>
+        </w:rPr>
+        <w:t xml:space="preserve"> envía las credenciales al </w:t>
+      </w:r>
+      <w:proofErr w:type="spellStart"/>
+      <w:r>
+        <w:rPr>
+          <w:lang w:val="es-PE"/>
+        </w:rPr>
+        <w:t>backend</w:t>
+      </w:r>
+      <w:proofErr w:type="spellEnd"/>
+      <w:r>
+        <w:rPr>
+          <w:lang w:val="es-PE"/>
+        </w:rPr>
+        <w:t xml:space="preserve"> (</w:t>
+      </w:r>
+      <w:proofErr w:type="spellStart"/>
+      <w:r>
+        <w:rPr>
+          <w:lang w:val="es-PE"/>
+        </w:rPr>
+        <w:t>FastAPI</w:t>
+      </w:r>
+      <w:proofErr w:type="spellEnd"/>
+      <w:r>
+        <w:rPr>
+          <w:lang w:val="es-PE"/>
+        </w:rPr>
+        <w:t xml:space="preserve">), que valida el hash </w:t>
+      </w:r>
+      <w:proofErr w:type="spellStart"/>
+      <w:r>
+        <w:rPr>
+          <w:lang w:val="es-PE"/>
+        </w:rPr>
+        <w:t>bcrypt</w:t>
+      </w:r>
+      <w:proofErr w:type="spellEnd"/>
+      <w:r>
+        <w:rPr>
+          <w:lang w:val="es-PE"/>
+        </w:rPr>
+        <w:t xml:space="preserve"> y devuelve un JWT.</w:t>
       </w:r>
     </w:p>
     <w:p>
@@ -8991,7 +11192,63 @@
         <w:rPr>
           <w:lang w:val="es-PE"/>
         </w:rPr>
-        <w:t>El frontend solicita la creación de una nueva sesión (POST /sessions/start); el backend registra la sesión en PostgreSQL con estado ACTIVA.</w:t>
+        <w:t xml:space="preserve">El </w:t>
+      </w:r>
+      <w:proofErr w:type="spellStart"/>
+      <w:r>
+        <w:rPr>
+          <w:lang w:val="es-PE"/>
+        </w:rPr>
+        <w:t>frontend</w:t>
+      </w:r>
+      <w:proofErr w:type="spellEnd"/>
+      <w:r>
+        <w:rPr>
+          <w:lang w:val="es-PE"/>
+        </w:rPr>
+        <w:t xml:space="preserve"> solicita la creación de una nueva sesión (POST /</w:t>
+      </w:r>
+      <w:proofErr w:type="spellStart"/>
+      <w:r>
+        <w:rPr>
+          <w:lang w:val="es-PE"/>
+        </w:rPr>
+        <w:t>sessions</w:t>
+      </w:r>
+      <w:proofErr w:type="spellEnd"/>
+      <w:r>
+        <w:rPr>
+          <w:lang w:val="es-PE"/>
+        </w:rPr>
+        <w:t>/</w:t>
+      </w:r>
+      <w:proofErr w:type="spellStart"/>
+      <w:r>
+        <w:rPr>
+          <w:lang w:val="es-PE"/>
+        </w:rPr>
+        <w:t>start</w:t>
+      </w:r>
+      <w:proofErr w:type="spellEnd"/>
+      <w:r>
+        <w:rPr>
+          <w:lang w:val="es-PE"/>
+        </w:rPr>
+        <w:t xml:space="preserve">); el </w:t>
+      </w:r>
+      <w:proofErr w:type="spellStart"/>
+      <w:r>
+        <w:rPr>
+          <w:lang w:val="es-PE"/>
+        </w:rPr>
+        <w:t>backend</w:t>
+      </w:r>
+      <w:proofErr w:type="spellEnd"/>
+      <w:r>
+        <w:rPr>
+          <w:lang w:val="es-PE"/>
+        </w:rPr>
+        <w:t xml:space="preserve"> registra la sesión en PostgreSQL con estado ACTIVA.</w:t>
       </w:r>
     </w:p>
     <w:p>
@@ -9011,7 +11268,63 @@
         <w:rPr>
           <w:lang w:val="es-PE"/>
         </w:rPr>
-        <w:t>Durante 30 segundos, el frontend captura video por la MediaDevices API y el backend lee la señal EMG del Arduino por pyserial.</w:t>
+        <w:t xml:space="preserve">Durante 30 segundos, el </w:t>
+      </w:r>
+      <w:proofErr w:type="spellStart"/>
+      <w:r>
+        <w:rPr>
+          <w:lang w:val="es-PE"/>
+        </w:rPr>
+        <w:t>frontend</w:t>
+      </w:r>
+      <w:proofErr w:type="spellEnd"/>
+      <w:r>
+        <w:rPr>
+          <w:lang w:val="es-PE"/>
+        </w:rPr>
+        <w:t xml:space="preserve"> captura video por la </w:t>
+      </w:r>
+      <w:proofErr w:type="spellStart"/>
+      <w:r>
+        <w:rPr>
+          <w:lang w:val="es-PE"/>
+        </w:rPr>
+        <w:t>MediaDevices</w:t>
+      </w:r>
+      <w:proofErr w:type="spellEnd"/>
+      <w:r>
+        <w:rPr>
+          <w:lang w:val="es-PE"/>
+        </w:rPr>
+        <w:t xml:space="preserve"> API y el </w:t>
+      </w:r>
+      <w:proofErr w:type="spellStart"/>
+      <w:r>
+        <w:rPr>
+          <w:lang w:val="es-PE"/>
+        </w:rPr>
+        <w:t>backend</w:t>
+      </w:r>
+      <w:proofErr w:type="spellEnd"/>
+      <w:r>
+        <w:rPr>
+          <w:lang w:val="es-PE"/>
+        </w:rPr>
+        <w:t xml:space="preserve"> lee la señal EMG del Arduino por </w:t>
+      </w:r>
+      <w:proofErr w:type="spellStart"/>
+      <w:r>
+        <w:rPr>
+          <w:lang w:val="es-PE"/>
+        </w:rPr>
+        <w:t>pyserial</w:t>
+      </w:r>
+      <w:proofErr w:type="spellEnd"/>
+      <w:r>
+        <w:rPr>
+          <w:lang w:val="es-PE"/>
+        </w:rPr>
+        <w:t>.</w:t>
       </w:r>
     </w:p>
     <w:p>
@@ -9031,7 +11344,63 @@
         <w:rPr>
           <w:lang w:val="es-PE"/>
         </w:rPr>
-        <w:t>Al finalizar, el frontend envía el video al backend (POST /sessions/upload).</w:t>
+        <w:t xml:space="preserve">Al finalizar, el </w:t>
+      </w:r>
+      <w:proofErr w:type="spellStart"/>
+      <w:r>
+        <w:rPr>
+          <w:lang w:val="es-PE"/>
+        </w:rPr>
+        <w:t>frontend</w:t>
+      </w:r>
+      <w:proofErr w:type="spellEnd"/>
+      <w:r>
+        <w:rPr>
+          <w:lang w:val="es-PE"/>
+        </w:rPr>
+        <w:t xml:space="preserve"> envía el video al </w:t>
+      </w:r>
+      <w:proofErr w:type="spellStart"/>
+      <w:r>
+        <w:rPr>
+          <w:lang w:val="es-PE"/>
+        </w:rPr>
+        <w:t>backend</w:t>
+      </w:r>
+      <w:proofErr w:type="spellEnd"/>
+      <w:r>
+        <w:rPr>
+          <w:lang w:val="es-PE"/>
+        </w:rPr>
+        <w:t xml:space="preserve"> (POST /</w:t>
+      </w:r>
+      <w:proofErr w:type="spellStart"/>
+      <w:r>
+        <w:rPr>
+          <w:lang w:val="es-PE"/>
+        </w:rPr>
+        <w:t>sessions</w:t>
+      </w:r>
+      <w:proofErr w:type="spellEnd"/>
+      <w:r>
+        <w:rPr>
+          <w:lang w:val="es-PE"/>
+        </w:rPr>
+        <w:t>/</w:t>
+      </w:r>
+      <w:proofErr w:type="spellStart"/>
+      <w:r>
+        <w:rPr>
+          <w:lang w:val="es-PE"/>
+        </w:rPr>
+        <w:t>upload</w:t>
+      </w:r>
+      <w:proofErr w:type="spellEnd"/>
+      <w:r>
+        <w:rPr>
+          <w:lang w:val="es-PE"/>
+        </w:rPr>
+        <w:t>).</w:t>
       </w:r>
     </w:p>
     <w:p>
@@ -9051,7 +11420,35 @@
         <w:rPr>
           <w:lang w:val="es-PE"/>
         </w:rPr>
-        <w:t>El backend ejecuta el Módulo 1 (visión conductual) y obtiene P_somnolencia.</w:t>
+        <w:t xml:space="preserve">El </w:t>
+      </w:r>
+      <w:proofErr w:type="spellStart"/>
+      <w:r>
+        <w:rPr>
+          <w:lang w:val="es-PE"/>
+        </w:rPr>
+        <w:t>backend</w:t>
+      </w:r>
+      <w:proofErr w:type="spellEnd"/>
+      <w:r>
+        <w:rPr>
+          <w:lang w:val="es-PE"/>
+        </w:rPr>
+        <w:t xml:space="preserve"> ejecuta el Módulo 1 (visión conductual) y obtiene </w:t>
+      </w:r>
+      <w:proofErr w:type="spellStart"/>
+      <w:r>
+        <w:rPr>
+          <w:lang w:val="es-PE"/>
+        </w:rPr>
+        <w:t>P_somnolencia</w:t>
+      </w:r>
+      <w:proofErr w:type="spellEnd"/>
+      <w:r>
+        <w:rPr>
+          <w:lang w:val="es-PE"/>
+        </w:rPr>
+        <w:t>.</w:t>
       </w:r>
     </w:p>
     <w:p>
@@ -9071,7 +11468,49 @@
         <w:rPr>
           <w:lang w:val="es-PE"/>
         </w:rPr>
-        <w:t>El backend ejecuta el Módulo 2 (fisiológico), extrayendo rPPG del mismo video y features del EMG capturado; obtiene P_fatiga_fisiológica.</w:t>
+        <w:t xml:space="preserve">El </w:t>
+      </w:r>
+      <w:proofErr w:type="spellStart"/>
+      <w:r>
+        <w:rPr>
+          <w:lang w:val="es-PE"/>
+        </w:rPr>
+        <w:t>backend</w:t>
+      </w:r>
+      <w:proofErr w:type="spellEnd"/>
+      <w:r>
+        <w:rPr>
+          <w:lang w:val="es-PE"/>
+        </w:rPr>
+        <w:t xml:space="preserve"> ejecuta el Módulo 2 (fisiológico), extrayendo </w:t>
+      </w:r>
+      <w:proofErr w:type="spellStart"/>
+      <w:r>
+        <w:rPr>
+          <w:lang w:val="es-PE"/>
+        </w:rPr>
+        <w:t>rPPG</w:t>
+      </w:r>
+      <w:proofErr w:type="spellEnd"/>
+      <w:r>
+        <w:rPr>
+          <w:lang w:val="es-PE"/>
+        </w:rPr>
+        <w:t xml:space="preserve"> del mismo video y </w:t>
+      </w:r>
+      <w:proofErr w:type="spellStart"/>
+      <w:r>
+        <w:rPr>
+          <w:lang w:val="es-PE"/>
+        </w:rPr>
+        <w:t>features</w:t>
+      </w:r>
+      <w:proofErr w:type="spellEnd"/>
+      <w:r>
+        <w:rPr>
+          <w:lang w:val="es-PE"/>
+        </w:rPr>
+        <w:t xml:space="preserve"> del EMG capturado; obtiene P_fatiga_fisiológica.</w:t>
       </w:r>
     </w:p>
     <w:p>
@@ -9091,7 +11530,21 @@
         <w:rPr>
           <w:lang w:val="es-PE"/>
         </w:rPr>
-        <w:t>El backend ejecuta el Módulo 3 (fusión) y obtiene el dictamen final: APTO, ATENCIÓN o NO APTO.</w:t>
+        <w:t xml:space="preserve">El </w:t>
+      </w:r>
+      <w:proofErr w:type="spellStart"/>
+      <w:r>
+        <w:rPr>
+          <w:lang w:val="es-PE"/>
+        </w:rPr>
+        <w:t>backend</w:t>
+      </w:r>
+      <w:proofErr w:type="spellEnd"/>
+      <w:r>
+        <w:rPr>
+          <w:lang w:val="es-PE"/>
+        </w:rPr>
+        <w:t xml:space="preserve"> ejecuta el Módulo 3 (fusión) y obtiene el dictamen final: APTO, ATENCIÓN o NO APTO.</w:t>
       </w:r>
     </w:p>
     <w:p>
@@ -9111,7 +11564,35 @@
         <w:rPr>
           <w:lang w:val="es-PE"/>
         </w:rPr>
-        <w:t>El backend persiste el resultado en PostgreSQL y lo retorna al frontend, que lo muestra como semáforo visual con la justificación correspondiente.</w:t>
+        <w:t xml:space="preserve">El </w:t>
+      </w:r>
+      <w:proofErr w:type="spellStart"/>
+      <w:r>
+        <w:rPr>
+          <w:lang w:val="es-PE"/>
+        </w:rPr>
+        <w:t>backend</w:t>
+      </w:r>
+      <w:proofErr w:type="spellEnd"/>
+      <w:r>
+        <w:rPr>
+          <w:lang w:val="es-PE"/>
+        </w:rPr>
+        <w:t xml:space="preserve"> persiste el resultado en PostgreSQL y lo retorna al </w:t>
+      </w:r>
+      <w:proofErr w:type="spellStart"/>
+      <w:r>
+        <w:rPr>
+          <w:lang w:val="es-PE"/>
+        </w:rPr>
+        <w:t>frontend</w:t>
+      </w:r>
+      <w:proofErr w:type="spellEnd"/>
+      <w:r>
+        <w:rPr>
+          <w:lang w:val="es-PE"/>
+        </w:rPr>
+        <w:t>, que lo muestra como semáforo visual con la justificación correspondiente.</w:t>
       </w:r>
     </w:p>
     <w:p>
@@ -13305,7 +15786,43 @@
                 <w:szCs w:val="16"/>
                 <w:lang w:eastAsia="es-PE"/>
               </w:rPr>
-              <w:t>Sensor electromiográfico superficial (sEMG)</w:t>
+              <w:t xml:space="preserve">Sensor </w:t>
+            </w:r>
+            <w:proofErr w:type="spellStart"/>
+            <w:r>
+              <w:rPr>
+                <w:sz w:val="16"/>
+                <w:szCs w:val="16"/>
+                <w:lang w:eastAsia="es-PE"/>
+              </w:rPr>
+              <w:t>electromiográfico</w:t>
+            </w:r>
+            <w:proofErr w:type="spellEnd"/>
+            <w:r>
+              <w:rPr>
+                <w:sz w:val="16"/>
+                <w:szCs w:val="16"/>
+                <w:lang w:eastAsia="es-PE"/>
+              </w:rPr>
+              <w:t xml:space="preserve"> superficial (</w:t>
+            </w:r>
+            <w:proofErr w:type="spellStart"/>
+            <w:r>
+              <w:rPr>
+                <w:sz w:val="16"/>
+                <w:szCs w:val="16"/>
+                <w:lang w:eastAsia="es-PE"/>
+              </w:rPr>
+              <w:t>sEMG</w:t>
+            </w:r>
+            <w:proofErr w:type="spellEnd"/>
+            <w:r>
+              <w:rPr>
+                <w:sz w:val="16"/>
+                <w:szCs w:val="16"/>
+                <w:lang w:eastAsia="es-PE"/>
+              </w:rPr>
+              <w:t>)</w:t>
             </w:r>
           </w:p>
         </w:tc>
@@ -13505,7 +16022,43 @@
                 <w:szCs w:val="16"/>
                 <w:lang w:eastAsia="es-PE"/>
               </w:rPr>
-              <w:t>Kit de conexión (cables USB/dupont, protoboard)</w:t>
+              <w:t>Kit de conexión (cables USB/</w:t>
+            </w:r>
+            <w:proofErr w:type="spellStart"/>
+            <w:r>
+              <w:rPr>
+                <w:sz w:val="16"/>
+                <w:szCs w:val="16"/>
+                <w:lang w:eastAsia="es-PE"/>
+              </w:rPr>
+              <w:t>dupont</w:t>
+            </w:r>
+            <w:proofErr w:type="spellEnd"/>
+            <w:r>
+              <w:rPr>
+                <w:sz w:val="16"/>
+                <w:szCs w:val="16"/>
+                <w:lang w:eastAsia="es-PE"/>
+              </w:rPr>
+              <w:t xml:space="preserve">, </w:t>
+            </w:r>
+            <w:proofErr w:type="spellStart"/>
+            <w:r>
+              <w:rPr>
+                <w:sz w:val="16"/>
+                <w:szCs w:val="16"/>
+                <w:lang w:eastAsia="es-PE"/>
+              </w:rPr>
+              <w:t>protoboard</w:t>
+            </w:r>
+            <w:proofErr w:type="spellEnd"/>
+            <w:r>
+              <w:rPr>
+                <w:sz w:val="16"/>
+                <w:szCs w:val="16"/>
+                <w:lang w:eastAsia="es-PE"/>
+              </w:rPr>
+              <w:t>)</w:t>
             </w:r>
           </w:p>
         </w:tc>
@@ -14247,13 +16800,23 @@
                 <w:lang w:eastAsia="es-PE"/>
               </w:rPr>
             </w:pPr>
-            <w:r>
-              <w:rPr>
-                <w:sz w:val="16"/>
-                <w:szCs w:val="16"/>
-                <w:lang w:eastAsia="es-PE"/>
-              </w:rPr>
-              <w:t>TOTAL PRESUPUESTO DEL PROUCTO ACREDITABLE</w:t>
+            <w:proofErr w:type="gramStart"/>
+            <w:r>
+              <w:rPr>
+                <w:sz w:val="16"/>
+                <w:szCs w:val="16"/>
+                <w:lang w:eastAsia="es-PE"/>
+              </w:rPr>
+              <w:t>TOTAL</w:t>
+            </w:r>
+            <w:proofErr w:type="gramEnd"/>
+            <w:r>
+              <w:rPr>
+                <w:sz w:val="16"/>
+                <w:szCs w:val="16"/>
+                <w:lang w:eastAsia="es-PE"/>
+              </w:rPr>
+              <w:t xml:space="preserve"> PRESUPUESTO DEL PROUCTO ACREDITABLE</w:t>
             </w:r>
           </w:p>
         </w:tc>
@@ -15481,7 +18044,25 @@
                 <w:szCs w:val="16"/>
                 <w:lang w:eastAsia="es-PE"/>
               </w:rPr>
-              <w:t>Sistema de copias de seguridad y almacenamiento en la nube (backup semanal y logs).</w:t>
+              <w:t>Sistema de copias de seguridad y almacenamiento en la nube (</w:t>
+            </w:r>
+            <w:proofErr w:type="spellStart"/>
+            <w:r>
+              <w:rPr>
+                <w:sz w:val="16"/>
+                <w:szCs w:val="16"/>
+                <w:lang w:eastAsia="es-PE"/>
+              </w:rPr>
+              <w:t>backup</w:t>
+            </w:r>
+            <w:proofErr w:type="spellEnd"/>
+            <w:r>
+              <w:rPr>
+                <w:sz w:val="16"/>
+                <w:szCs w:val="16"/>
+                <w:lang w:eastAsia="es-PE"/>
+              </w:rPr>
+              <w:t xml:space="preserve"> semanal y logs).</w:t>
             </w:r>
           </w:p>
         </w:tc>
@@ -16295,13 +18876,23 @@
                 <w:lang w:eastAsia="es-PE"/>
               </w:rPr>
             </w:pPr>
-            <w:r>
-              <w:rPr>
-                <w:sz w:val="16"/>
-                <w:szCs w:val="16"/>
-                <w:lang w:eastAsia="es-PE"/>
-              </w:rPr>
-              <w:t>TOTAL PRESUPUESTO TECNOLÓGICO</w:t>
+            <w:proofErr w:type="gramStart"/>
+            <w:r>
+              <w:rPr>
+                <w:sz w:val="16"/>
+                <w:szCs w:val="16"/>
+                <w:lang w:eastAsia="es-PE"/>
+              </w:rPr>
+              <w:t>TOTAL</w:t>
+            </w:r>
+            <w:proofErr w:type="gramEnd"/>
+            <w:r>
+              <w:rPr>
+                <w:sz w:val="16"/>
+                <w:szCs w:val="16"/>
+                <w:lang w:eastAsia="es-PE"/>
+              </w:rPr>
+              <w:t xml:space="preserve"> PRESUPUESTO TECNOLÓGICO</w:t>
             </w:r>
           </w:p>
         </w:tc>
@@ -16740,13 +19331,23 @@
                 <w:lang w:eastAsia="es-PE"/>
               </w:rPr>
             </w:pPr>
+            <w:proofErr w:type="gramStart"/>
             <w:r>
               <w:rPr>
                 <w:sz w:val="20"/>
                 <w:szCs w:val="20"/>
                 <w:lang w:eastAsia="es-PE"/>
               </w:rPr>
-              <w:t>TOTAL PRESUPUESTO DEL PRODUCTO ACREDITABLE</w:t>
+              <w:t>TOTAL</w:t>
+            </w:r>
+            <w:proofErr w:type="gramEnd"/>
+            <w:r>
+              <w:rPr>
+                <w:sz w:val="20"/>
+                <w:szCs w:val="20"/>
+                <w:lang w:eastAsia="es-PE"/>
+              </w:rPr>
+              <w:t xml:space="preserve"> PRESUPUESTO DEL PRODUCTO ACREDITABLE</w:t>
             </w:r>
           </w:p>
         </w:tc>
@@ -16848,13 +19449,23 @@
                 <w:lang w:eastAsia="es-PE"/>
               </w:rPr>
             </w:pPr>
+            <w:proofErr w:type="gramStart"/>
             <w:r>
               <w:rPr>
                 <w:sz w:val="20"/>
                 <w:szCs w:val="20"/>
                 <w:lang w:eastAsia="es-PE"/>
               </w:rPr>
-              <w:t>TOTAL PRESUPUESTO TECNOLÓGICO</w:t>
+              <w:t>TOTAL</w:t>
+            </w:r>
+            <w:proofErr w:type="gramEnd"/>
+            <w:r>
+              <w:rPr>
+                <w:sz w:val="20"/>
+                <w:szCs w:val="20"/>
+                <w:lang w:eastAsia="es-PE"/>
+              </w:rPr>
+              <w:t xml:space="preserve"> PRESUPUESTO TECNOLÓGICO</w:t>
             </w:r>
           </w:p>
         </w:tc>
@@ -16946,6 +19557,7 @@
                 <w:lang w:eastAsia="es-PE"/>
               </w:rPr>
             </w:pPr>
+            <w:proofErr w:type="gramStart"/>
             <w:r>
               <w:rPr>
                 <w:bCs/>
@@ -16953,7 +19565,17 @@
                 <w:szCs w:val="20"/>
                 <w:lang w:eastAsia="es-PE"/>
               </w:rPr>
-              <w:t>TOTAL PRESUPUESTO</w:t>
+              <w:t>TOTAL</w:t>
+            </w:r>
+            <w:proofErr w:type="gramEnd"/>
+            <w:r>
+              <w:rPr>
+                <w:bCs/>
+                <w:sz w:val="20"/>
+                <w:szCs w:val="20"/>
+                <w:lang w:eastAsia="es-PE"/>
+              </w:rPr>
+              <w:t xml:space="preserve"> PRESUPUESTO</w:t>
             </w:r>
           </w:p>
         </w:tc>
@@ -17192,6 +19814,7 @@
                 <w:lang w:eastAsia="es-PE"/>
               </w:rPr>
             </w:pPr>
+            <w:proofErr w:type="spellStart"/>
             <w:r>
               <w:rPr>
                 <w:bCs/>
@@ -17201,6 +19824,7 @@
               </w:rPr>
               <w:t>Nª</w:t>
             </w:r>
+            <w:proofErr w:type="spellEnd"/>
           </w:p>
         </w:tc>
         <w:tc>
@@ -18371,7 +20995,31 @@
           <w:szCs w:val="24"/>
           <w:u w:val="single"/>
         </w:rPr>
-        <w:t>ANEXO N° 01. CARTA DE ACEPTACIÓN DE LA INSTITUCIÓN PARA LA EJECUCIÓN DEL PROYECTO</w:t>
+        <w:t xml:space="preserve">ANEXO </w:t>
+      </w:r>
+      <w:proofErr w:type="spellStart"/>
+      <w:r>
+        <w:rPr>
+          <w:rFonts w:ascii="Times New Roman" w:hAnsi="Times New Roman" w:cs="Times New Roman"/>
+          <w:b/>
+          <w:color w:val="000000" w:themeColor="text1"/>
+          <w:sz w:val="24"/>
+          <w:szCs w:val="24"/>
+          <w:u w:val="single"/>
+        </w:rPr>
+        <w:t>N°</w:t>
+      </w:r>
+      <w:proofErr w:type="spellEnd"/>
+      <w:r>
+        <w:rPr>
+          <w:rFonts w:ascii="Times New Roman" w:hAnsi="Times New Roman" w:cs="Times New Roman"/>
+          <w:b/>
+          <w:color w:val="000000" w:themeColor="text1"/>
+          <w:sz w:val="24"/>
+          <w:szCs w:val="24"/>
+          <w:u w:val="single"/>
+        </w:rPr>
+        <w:t xml:space="preserve"> 01. CARTA DE ACEPTACIÓN DE LA INSTITUCIÓN PARA LA EJECUCIÓN DEL PROYECTO</w:t>
       </w:r>
       <w:bookmarkStart w:id="28" w:name="_Toc20467666"/>
       <w:bookmarkEnd w:id="27"/>
@@ -18458,6 +21106,7 @@
         <w:lastRenderedPageBreak/>
         <w:t xml:space="preserve">ANEXO </w:t>
       </w:r>
+      <w:proofErr w:type="spellStart"/>
       <w:r>
         <w:rPr>
           <w:rFonts w:ascii="Times New Roman" w:hAnsi="Times New Roman" w:cs="Times New Roman"/>
@@ -18469,6 +21118,7 @@
         </w:rPr>
         <w:t>N°</w:t>
       </w:r>
+      <w:proofErr w:type="spellEnd"/>
       <w:r>
         <w:rPr>
           <w:rFonts w:ascii="Times New Roman" w:hAnsi="Times New Roman" w:cs="Times New Roman"/>
@@ -18635,7 +21285,21 @@
         <w:rPr>
           <w:lang w:val="es-PE"/>
         </w:rPr>
-        <w:t>¿En qué horarios se percibe mayor somnolencia (madrugada, post-guardia, listas largas)?</w:t>
+        <w:t xml:space="preserve">¿En qué horarios se percibe mayor somnolencia (madrugada, </w:t>
+      </w:r>
+      <w:proofErr w:type="spellStart"/>
+      <w:r>
+        <w:rPr>
+          <w:lang w:val="es-PE"/>
+        </w:rPr>
+        <w:t>post-guardia</w:t>
+      </w:r>
+      <w:proofErr w:type="spellEnd"/>
+      <w:r>
+        <w:rPr>
+          <w:lang w:val="es-PE"/>
+        </w:rPr>
+        <w:t>, listas largas)?</w:t>
       </w:r>
     </w:p>
     <w:p>
@@ -18683,7 +21347,49 @@
         <w:rPr>
           <w:lang w:val="es-PE"/>
         </w:rPr>
-        <w:t>¿Se han omitido pasos de listas de verificación (sign-in/time-out/sign-out) en situaciones de cansancio?</w:t>
+        <w:t>¿Se han omitido pasos de listas de verificación (</w:t>
+      </w:r>
+      <w:proofErr w:type="spellStart"/>
+      <w:r>
+        <w:rPr>
+          <w:lang w:val="es-PE"/>
+        </w:rPr>
+        <w:t>sign</w:t>
+      </w:r>
+      <w:proofErr w:type="spellEnd"/>
+      <w:r>
+        <w:rPr>
+          <w:lang w:val="es-PE"/>
+        </w:rPr>
+        <w:t>-in/time-</w:t>
+      </w:r>
+      <w:proofErr w:type="spellStart"/>
+      <w:r>
+        <w:rPr>
+          <w:lang w:val="es-PE"/>
+        </w:rPr>
+        <w:t>out</w:t>
+      </w:r>
+      <w:proofErr w:type="spellEnd"/>
+      <w:r>
+        <w:rPr>
+          <w:lang w:val="es-PE"/>
+        </w:rPr>
+        <w:t>/</w:t>
+      </w:r>
+      <w:proofErr w:type="spellStart"/>
+      <w:r>
+        <w:rPr>
+          <w:lang w:val="es-PE"/>
+        </w:rPr>
+        <w:t>sign-out</w:t>
+      </w:r>
+      <w:proofErr w:type="spellEnd"/>
+      <w:r>
+        <w:rPr>
+          <w:lang w:val="es-PE"/>
+        </w:rPr>
+        <w:t>) en situaciones de cansancio?</w:t>
       </w:r>
     </w:p>
     <w:p>
@@ -18699,7 +21405,35 @@
         <w:rPr>
           <w:lang w:val="es-PE"/>
         </w:rPr>
-        <w:t>¿Se reportan bostezos, microcierre de ojos o microcabeceo durante la operación?</w:t>
+        <w:t xml:space="preserve">¿Se reportan bostezos, </w:t>
+      </w:r>
+      <w:proofErr w:type="spellStart"/>
+      <w:r>
+        <w:rPr>
+          <w:lang w:val="es-PE"/>
+        </w:rPr>
+        <w:t>microcierre</w:t>
+      </w:r>
+      <w:proofErr w:type="spellEnd"/>
+      <w:r>
+        <w:rPr>
+          <w:lang w:val="es-PE"/>
+        </w:rPr>
+        <w:t xml:space="preserve"> de ojos o </w:t>
+      </w:r>
+      <w:proofErr w:type="spellStart"/>
+      <w:r>
+        <w:rPr>
+          <w:lang w:val="es-PE"/>
+        </w:rPr>
+        <w:t>microcabeceo</w:t>
+      </w:r>
+      <w:proofErr w:type="spellEnd"/>
+      <w:r>
+        <w:rPr>
+          <w:lang w:val="es-PE"/>
+        </w:rPr>
+        <w:t xml:space="preserve"> durante la operación?</w:t>
       </w:r>
     </w:p>
     <w:p>
@@ -18827,7 +21561,21 @@
         <w:rPr>
           <w:lang w:val="es-PE"/>
         </w:rPr>
-        <w:t>¿El personal recibe apoyo para manejo de estrés y carga emocional (coaching, debrief, consejería)?</w:t>
+        <w:t xml:space="preserve">¿El personal recibe apoyo para manejo de estrés y carga emocional (coaching, </w:t>
+      </w:r>
+      <w:proofErr w:type="spellStart"/>
+      <w:r>
+        <w:rPr>
+          <w:lang w:val="es-PE"/>
+        </w:rPr>
+        <w:t>debrief</w:t>
+      </w:r>
+      <w:proofErr w:type="spellEnd"/>
+      <w:r>
+        <w:rPr>
+          <w:lang w:val="es-PE"/>
+        </w:rPr>
+        <w:t>, consejería)?</w:t>
       </w:r>
     </w:p>
     <w:p>
@@ -18870,7 +21618,31 @@
           <w:szCs w:val="24"/>
           <w:u w:val="single"/>
         </w:rPr>
-        <w:t>ANEXO N° 0</w:t>
+        <w:t xml:space="preserve">ANEXO </w:t>
+      </w:r>
+      <w:proofErr w:type="spellStart"/>
+      <w:r>
+        <w:rPr>
+          <w:rFonts w:ascii="Times New Roman" w:hAnsi="Times New Roman" w:cs="Times New Roman"/>
+          <w:b/>
+          <w:color w:val="000000" w:themeColor="text1"/>
+          <w:sz w:val="24"/>
+          <w:szCs w:val="24"/>
+          <w:u w:val="single"/>
+        </w:rPr>
+        <w:t>N°</w:t>
+      </w:r>
+      <w:proofErr w:type="spellEnd"/>
+      <w:r>
+        <w:rPr>
+          <w:rFonts w:ascii="Times New Roman" w:hAnsi="Times New Roman" w:cs="Times New Roman"/>
+          <w:b/>
+          <w:color w:val="000000" w:themeColor="text1"/>
+          <w:sz w:val="24"/>
+          <w:szCs w:val="24"/>
+          <w:u w:val="single"/>
+        </w:rPr>
+        <w:t xml:space="preserve"> 0</w:t>
       </w:r>
       <w:r>
         <w:rPr>
@@ -22896,6 +25668,7 @@
   <w:style w:type="character" w:default="1" w:styleId="Fuentedeprrafopredeter">
     <w:name w:val="Default Paragraph Font"/>
     <w:uiPriority w:val="1"/>
+    <w:semiHidden/>
     <w:unhideWhenUsed/>
   </w:style>
   <w:style w:type="table" w:default="1" w:styleId="Tablanormal">
@@ -23773,6 +26546,10 @@
 </file>
 
 <file path=customXml/item1.xml><?xml version="1.0" encoding="utf-8"?>
+<b:Sources xmlns:b="http://schemas.openxmlformats.org/officeDocument/2006/bibliography" xmlns="http://schemas.openxmlformats.org/officeDocument/2006/bibliography" SelectedStyle="\APASixthEditionOfficeOnline.xsl" StyleName="APA" Version="6"/>
+</file>
+
+<file path=customXml/item2.xml><?xml version="1.0" encoding="utf-8"?>
 <s:customData xmlns="http://www.wps.cn/officeDocument/2013/wpsCustomData" xmlns:s="http://www.wps.cn/officeDocument/2013/wpsCustomData">
   <customSectProps>
     <customSectPr/>
@@ -23789,22 +26566,18 @@
 </s:customData>
 </file>
 
-<file path=customXml/item2.xml><?xml version="1.0" encoding="utf-8"?>
-<b:Sources xmlns:b="http://schemas.openxmlformats.org/officeDocument/2006/bibliography" xmlns="http://schemas.openxmlformats.org/officeDocument/2006/bibliography" SelectedStyle="\APASixthEditionOfficeOnline.xsl" StyleName="APA" Version="6"/>
+<file path=customXml/itemProps1.xml><?xml version="1.0" encoding="utf-8"?>
+<ds:datastoreItem xmlns:ds="http://schemas.openxmlformats.org/officeDocument/2006/customXml" ds:itemID="{00E4D149-CC82-42B8-B25A-39DD1C4D8B23}">
+  <ds:schemaRefs>
+    <ds:schemaRef ds:uri="http://schemas.openxmlformats.org/officeDocument/2006/bibliography"/>
+  </ds:schemaRefs>
+</ds:datastoreItem>
 </file>
 
-<file path=customXml/itemProps1.xml><?xml version="1.0" encoding="utf-8"?>
+<file path=customXml/itemProps2.xml><?xml version="1.0" encoding="utf-8"?>
 <ds:datastoreItem xmlns:ds="http://schemas.openxmlformats.org/officeDocument/2006/customXml" ds:itemID="{B1977F7D-205B-4081-913C-38D41E755F92}">
   <ds:schemaRefs>
     <ds:schemaRef ds:uri="http://www.wps.cn/officeDocument/2013/wpsCustomData"/>
   </ds:schemaRefs>
 </ds:datastoreItem>
-</file>
-
-<file path=customXml/itemProps2.xml><?xml version="1.0" encoding="utf-8"?>
-<ds:datastoreItem xmlns:ds="http://schemas.openxmlformats.org/officeDocument/2006/customXml" ds:itemID="{00E4D149-CC82-42B8-B25A-39DD1C4D8B23}">
-  <ds:schemaRefs>
-    <ds:schemaRef ds:uri="http://schemas.openxmlformats.org/officeDocument/2006/bibliography"/>
-  </ds:schemaRefs>
-</ds:datastoreItem>
 </file>
</xml_diff>